<commit_message>
Trabajo pendiente en la rama: filtros por columna en detalle RCV contable, scripts LRE, plantillas y previews
- Detalle RCV de contabilidad ([clienteId]/rcv): cajitas de filtro de texto
  por columna en el encabezado (trabajo previo de la rama).
- .gitignore: ignora .vercel y .env*.
- Scripts LRE (cargar/importar/sincronizar OneDrive) y crear-fichas-boletas.
- Plantilla SARGO actualizada, public/plantillas, launch.json del preview,
  previews de correos y documentos de trabajo.

Co-Authored-By: Claude Fable 5 <noreply@anthropic.com>
</commit_message>
<xml_diff>
--- a/plantillas-fuente/SARGO 78179175-K/CONTRATO ATENDEDOR PT 21h - Plazo Fijo.docx
+++ b/plantillas-fuente/SARGO 78179175-K/CONTRATO ATENDEDOR PT 21h - Plazo Fijo.docx
@@ -33,7 +33,23 @@
     </w:p>
     <w:p>
       <w:r>
-        <w:t>En la ciudad de Curauma, a {FECHA_INICIO_CONTRATO}, entre {RAZON_SOCIAL}, Rol Único Tributario {RUT_EMPRESA}, representada legalmente por don {NOMBRE_REP_LEGAL}, Cédula Nacional de Identidad {RUT_REP_LEGAL}, ambos domiciliados para estos efectos en {DIRECCION_EMPRESA}, correo electrónico {EMAIL_EMPRESA}, en adelante "LA EMPRESA" o "EL EMPLEADOR"; y don/ña {NOMBRE_EMPLEADO}, nacionalidad {NACIONALIDAD_EMPLEADO}, Cédula de Identidad N° {RUT_EMPLEADO}, nacido el {FECHA_NACIMIENTO}, estado civil {ESTADO_CIVIL}, domiciliado en {DIRECCION_EMPLEADO} {COMUNA_EMPLEADO}, correo electrónico {EMAILPERSONAL_EMPLEADO}, teléfono {TELEFONOPERSONAL_EMPLEADO}, en adelante "EL TRABAJADOR", se ha convenido y pactado el siguiente contrato de trabajo:</w:t>
+        <w:t>En la ciudad de Curauma, a {FECHA_INICIO_CONTRATO}, entre {RAZON_SOCIAL}, Rol Único Tributario {RUT_EMPRESA}, representada legalmente por don {NOMBRE_REP_LEGAL}, Cédula Nacional de Identidad {RUT_REP_LEGAL}, ambos domiciliados para estos efectos en {DIRECCION_EMPRESA}, correo electrónico {EMAIL_EMPRESA}, en adelante "LA EMPRESA" o "EL EMPLEADOR"; y don/</w:t>
+      </w:r>
+      <w:proofErr w:type="spellStart"/>
+      <w:r>
+        <w:t>ña</w:t>
+      </w:r>
+      <w:proofErr w:type="spellEnd"/>
+      <w:r>
+        <w:t xml:space="preserve"> {NOMBRE_EMPLEADO}, nacionalidad {NACIONALIDAD_EMPLEADO}, Cédula de Identidad </w:t>
+      </w:r>
+      <w:proofErr w:type="spellStart"/>
+      <w:r>
+        <w:t>N°</w:t>
+      </w:r>
+      <w:proofErr w:type="spellEnd"/>
+      <w:r>
+        <w:t> {RUT_EMPLEADO}, nacido el {FECHA_NACIMIENTO}, estado civil {ESTADO_CIVIL}, domiciliado en {DIRECCION_EMPLEADO} {COMUNA_EMPLEADO}, correo electrónico {EMAILPERSONAL_EMPLEADO}, teléfono {TELEFONOPERSONAL_EMPLEADO}, en adelante "EL TRABAJADOR", se ha convenido y pactado el siguiente contrato de trabajo:</w:t>
       </w:r>
     </w:p>
     <w:p>
@@ -45,7 +61,23 @@
         <w:t>PRIMERO: NATURALEZA DE LOS SERVICIOS Y FUNCIONES.</w:t>
       </w:r>
       <w:r>
-        <w:t xml:space="preserve"> El TRABAJADOR se desempeñará en el cargo de {CARGO}, obligándose a ejecutar todas las funciones inherentes a la atención integral del cliente, a la venta de productos, elaboración de alimentos, aseo del recinto para la tienda aStop operada por el empleador {RAZON_SOCIAL} en las dependencias ubicadas en {DIRECCION_EMPRESA}. Las funciones, que se describen a título enunciativo pero no taxativo, comprenden:</w:t>
+        <w:t xml:space="preserve"> El TRABAJADOR se desempeñará en el cargo de {CARGO}, obligándose a ejecutar todas las funciones inherentes a la atención integral del cliente, a la venta de productos, elaboración de alimentos, aseo del recinto para la tienda </w:t>
+      </w:r>
+      <w:proofErr w:type="spellStart"/>
+      <w:r>
+        <w:t>aStop</w:t>
+      </w:r>
+      <w:proofErr w:type="spellEnd"/>
+      <w:r>
+        <w:t xml:space="preserve"> operada por el empleador {RAZON_SOCIAL} en las dependencias ubicadas en {DIRECCION_EMPRESA}. Las funciones, que se describen a título </w:t>
+      </w:r>
+      <w:proofErr w:type="gramStart"/>
+      <w:r>
+        <w:t>enunciativo</w:t>
+      </w:r>
+      <w:proofErr w:type="gramEnd"/>
+      <w:r>
+        <w:t xml:space="preserve"> pero no taxativo, comprenden:</w:t>
       </w:r>
     </w:p>
     <w:p>
@@ -95,14 +127,39 @@
         <w:t>Funciones Integrales de Tienda:</w:t>
       </w:r>
       <w:r>
-        <w:t xml:space="preserve"> Ejecutar y realizar íntegramente las labores de Atendedor y Cajero del aStop. A modo de ejemplo, deberá desarrollar labores de: operación de caja, atención de público, aseo general del establecimiento, limpieza de equipos y utensilios, cuidado de la mercadería puesta a la venta, así como la oportuna reposición de la misma en góndolas y coolers.</w:t>
-      </w:r>
-    </w:p>
-    <w:p>
-      <w:r>
-        <w:rPr>
-          <w:b/>
-        </w:rPr>
+        <w:t xml:space="preserve"> Ejecutar y realizar íntegramente las labores de Atendedor y Cajero del </w:t>
+      </w:r>
+      <w:proofErr w:type="spellStart"/>
+      <w:r>
+        <w:t>aStop</w:t>
+      </w:r>
+      <w:proofErr w:type="spellEnd"/>
+      <w:r>
+        <w:t xml:space="preserve">. A modo de ejemplo, deberá desarrollar labores de: operación de caja, atención de público, aseo general del establecimiento, limpieza de equipos y utensilios, cuidado de la mercadería puesta a la venta, así como la oportuna reposición de </w:t>
+      </w:r>
+      <w:proofErr w:type="gramStart"/>
+      <w:r>
+        <w:t>la misma</w:t>
+      </w:r>
+      <w:proofErr w:type="gramEnd"/>
+      <w:r>
+        <w:t xml:space="preserve"> en góndolas y </w:t>
+      </w:r>
+      <w:proofErr w:type="spellStart"/>
+      <w:r>
+        <w:t>coolers</w:t>
+      </w:r>
+      <w:proofErr w:type="spellEnd"/>
+      <w:r>
+        <w:t>.</w:t>
+      </w:r>
+    </w:p>
+    <w:p>
+      <w:r>
+        <w:rPr>
+          <w:b/>
+        </w:rPr>
+        <w:lastRenderedPageBreak/>
         <w:t>3.- </w:t>
       </w:r>
       <w:r>
@@ -121,151 +178,145 @@
         <w:rPr>
           <w:b/>
         </w:rPr>
+        <w:t>4.- </w:t>
+      </w:r>
+      <w:r>
+        <w:rPr>
+          <w:b/>
+          <w:bCs/>
+        </w:rPr>
+        <w:t>Higiene y Sanitización:</w:t>
+      </w:r>
+      <w:r>
+        <w:t xml:space="preserve"> Realizar la mantención y aseo profundo de los baños (tanto del personal como de clientes) y de las instalaciones en general, asegurando los estándares de higiene exigidos por la franquicia.</w:t>
+      </w:r>
+    </w:p>
+    <w:p>
+      <w:r>
+        <w:rPr>
+          <w:b/>
+        </w:rPr>
+        <w:t>5.- </w:t>
+      </w:r>
+      <w:r>
+        <w:rPr>
+          <w:b/>
+          <w:bCs/>
+        </w:rPr>
+        <w:t>Registro de Asistencia:</w:t>
+      </w:r>
+      <w:r>
+        <w:t xml:space="preserve"> Firmar correcta y oportunamente el libro de asistencia (o marcar en el sistema electrónico), conforme a las disposiciones laborales vigentes, reconociendo este registro como el único medio de prueba de su jornada.</w:t>
+      </w:r>
+    </w:p>
+    <w:p>
+      <w:r>
+        <w:rPr>
+          <w:b/>
+        </w:rPr>
+        <w:t>6.- </w:t>
+      </w:r>
+      <w:r>
+        <w:rPr>
+          <w:b/>
+          <w:bCs/>
+        </w:rPr>
+        <w:t>Aviso de Ausencia:</w:t>
+      </w:r>
+      <w:r>
+        <w:t xml:space="preserve"> Dar aviso inmediato y con anticipación al jefe directo en caso de inasistencia por enfermedad u otra causa justificada que le impida concurrir transitoriamente al trabajo.</w:t>
+      </w:r>
+    </w:p>
+    <w:p>
+      <w:r>
+        <w:rPr>
+          <w:b/>
+        </w:rPr>
+        <w:t>7.- </w:t>
+      </w:r>
+      <w:r>
+        <w:rPr>
+          <w:b/>
+          <w:bCs/>
+        </w:rPr>
+        <w:t>Procedimiento de Depósito (Buzonera):</w:t>
+      </w:r>
+      <w:r>
+        <w:t xml:space="preserve"> Realizar los "depósitos" de caja de forma correcta en la buzonera, exhibiendo a la cámara de seguridad habilitada para este acto la acción física y el monto exacto que se deposita, para su respaldo visual.</w:t>
+      </w:r>
+    </w:p>
+    <w:p>
+      <w:r>
+        <w:rPr>
+          <w:b/>
+        </w:rPr>
+        <w:t>8.- </w:t>
+      </w:r>
+      <w:r>
+        <w:rPr>
+          <w:b/>
+          <w:bCs/>
+        </w:rPr>
+        <w:t>Límite Máximo de Efectivo (Seguridad Crítica):</w:t>
+      </w:r>
+      <w:r>
+        <w:t xml:space="preserve"> Por estrictas razones de seguridad personal y del recinto, el Trabajador no podrá mantener una cantidad de dinero en efectivo en su poder (caja/bolsillos) superior a $50.000 (cincuenta mil pesos). El excedente debe ser resguardado de inmediato en la buzonera.</w:t>
+      </w:r>
+    </w:p>
+    <w:p>
+      <w:r>
+        <w:rPr>
+          <w:b/>
+        </w:rPr>
+        <w:t>9.- </w:t>
+      </w:r>
+      <w:r>
+        <w:rPr>
+          <w:b/>
+          <w:bCs/>
+        </w:rPr>
+        <w:t>Ética y Normativa:</w:t>
+      </w:r>
+      <w:r>
+        <w:t xml:space="preserve"> Actuar estrictamente apegado a las disposiciones de este contrato y a las normas éticas y legales que digan relación con su labor.</w:t>
+      </w:r>
+    </w:p>
+    <w:p>
+      <w:r>
+        <w:rPr>
+          <w:b/>
+          <w:bCs/>
+        </w:rPr>
+        <w:t>10.- Fraude en Fidelización:</w:t>
+      </w:r>
+      <w:r>
+        <w:t xml:space="preserve"> Queda estrictamente prohibido ingresar su RUT personal, o el de otra persona que no sea el cliente presente, al momento de realizar una transacción para acumular puntos o millas "ARAMCO". Esta conducta se considerará falta de probidad grave.</w:t>
+      </w:r>
+    </w:p>
+    <w:p>
+      <w:r>
+        <w:rPr>
+          <w:b/>
+        </w:rPr>
+        <w:t>11.- </w:t>
+      </w:r>
+      <w:r>
+        <w:rPr>
+          <w:b/>
+          <w:bCs/>
+        </w:rPr>
+        <w:t>Seguridad Operacional:</w:t>
+      </w:r>
+      <w:r>
+        <w:t xml:space="preserve"> Reportar inmediatamente todo incidente, accidente o presunta enfermedad laboral, así como condiciones y actos inseguros que detecte en la tienda.</w:t>
+      </w:r>
+    </w:p>
+    <w:p>
+      <w:r>
+        <w:rPr>
+          <w:b/>
+        </w:rPr>
         <w:lastRenderedPageBreak/>
-        <w:t>4.- </w:t>
-      </w:r>
-      <w:r>
-        <w:rPr>
-          <w:b/>
-          <w:bCs/>
-        </w:rPr>
-        <w:t>Higiene y Sanitización:</w:t>
-      </w:r>
-      <w:r>
-        <w:t xml:space="preserve"> Realizar la mantención y aseo profundo de los baños (tanto del personal como de clientes) y de las instalaciones en general, asegurando los estándares de higiene exigidos por la franquicia.</w:t>
-      </w:r>
-    </w:p>
-    <w:p>
-      <w:r>
-        <w:rPr>
-          <w:b/>
-        </w:rPr>
-        <w:t>5.- </w:t>
-      </w:r>
-      <w:r>
-        <w:rPr>
-          <w:b/>
-          <w:bCs/>
-        </w:rPr>
-        <w:t>Registro de Asistencia:</w:t>
-      </w:r>
-      <w:r>
-        <w:t xml:space="preserve"> Firmar correcta y oportunamente el libro de asistencia (o marcar en el sistema electrónico), conforme a las disposiciones laborales vigentes, reconociendo este registro como el único medio de prueba de su jornada.</w:t>
-      </w:r>
-    </w:p>
-    <w:p>
-      <w:r>
-        <w:rPr>
-          <w:b/>
-        </w:rPr>
-        <w:t>6.- </w:t>
-      </w:r>
-      <w:r>
-        <w:rPr>
-          <w:b/>
-          <w:bCs/>
-        </w:rPr>
-        <w:t>Aviso de Ausencia:</w:t>
-      </w:r>
-      <w:r>
-        <w:t xml:space="preserve"> Dar aviso inmediato y con anticipación al jefe directo en caso de inasistencia por enfermedad u otra causa justificada que le impida concurrir transitoriamente al trabajo.</w:t>
-      </w:r>
-    </w:p>
-    <w:p>
-      <w:r>
-        <w:rPr>
-          <w:b/>
-        </w:rPr>
-        <w:t>7.- </w:t>
-      </w:r>
-      <w:r>
-        <w:rPr>
-          <w:b/>
-          <w:bCs/>
-        </w:rPr>
-        <w:t>Procedimiento de Depósito (Buzonera):</w:t>
-      </w:r>
-      <w:r>
-        <w:t xml:space="preserve"> Realizar los "depósitos" de caja de forma correcta en la buzonera, exhibiendo a la cámara de seguridad habilitada para este acto la acción física y el monto exacto que se deposita, para su respaldo visual.</w:t>
-      </w:r>
-    </w:p>
-    <w:p>
-      <w:r>
-        <w:rPr>
-          <w:b/>
-        </w:rPr>
-        <w:t>8.- </w:t>
-      </w:r>
-      <w:r>
-        <w:rPr>
-          <w:b/>
-          <w:bCs/>
-        </w:rPr>
-        <w:t>Límite Máximo de Efectivo (Seguridad Crítica):</w:t>
-      </w:r>
-      <w:r>
-        <w:t xml:space="preserve"> Por estrictas razones de seguridad personal y del recinto, el Trabajador no podrá mantener una cantidad de dinero en efectivo en su poder (caja/bolsillos) superior a $50.000 (cincuenta mil pesos). El excedente debe ser resguardado de inmediato en la buzonera.</w:t>
-      </w:r>
-    </w:p>
-    <w:p>
-      <w:r>
-        <w:rPr>
-          <w:b/>
-        </w:rPr>
-        <w:t>9.- </w:t>
-      </w:r>
-      <w:r>
-        <w:rPr>
-          <w:b/>
-          <w:bCs/>
-        </w:rPr>
-        <w:t>Ética y Normativa:</w:t>
-      </w:r>
-      <w:r>
-        <w:t xml:space="preserve"> Actuar estrictamente apegado a las disposiciones de este contrato y a las normas éticas y legales que digan relación con su labor.</w:t>
-      </w:r>
-    </w:p>
-    <w:p>
-      <w:r>
-        <w:rPr>
-          <w:b/>
-        </w:rPr>
-        <w:t xml:space="preserve"/>
-      </w:r>
-      <w:r>
-        <w:rPr>
-          <w:b/>
-          <w:bCs/>
-        </w:rPr>
-        <w:t>10.- Fraude en Fidelización:</w:t>
-      </w:r>
-      <w:r>
-        <w:t xml:space="preserve"> Queda estrictamente prohibido ingresar su RUT personal, o el de otra persona que no sea el cliente presente, al momento de realizar una transacción para acumular puntos o millas "ARAMCO". Esta conducta se considerará falta de probidad grave.</w:t>
-      </w:r>
-    </w:p>
-    <w:p>
-      <w:r>
-        <w:rPr>
-          <w:b/>
-        </w:rPr>
-        <w:t>11.- </w:t>
-      </w:r>
-      <w:r>
-        <w:rPr>
-          <w:b/>
-          <w:bCs/>
-        </w:rPr>
-        <w:t>Seguridad Operacional:</w:t>
-      </w:r>
-      <w:r>
-        <w:t xml:space="preserve"> Reportar inmediatamente todo incidente, accidente o presunta enfermedad laboral, así como condiciones y actos inseguros que detecte en la tienda.</w:t>
-      </w:r>
-    </w:p>
-    <w:p>
-      <w:r>
-        <w:rPr>
-          <w:b/>
-        </w:rPr>
         <w:t>12.- </w:t>
       </w:r>
       <w:r>
@@ -297,99 +348,107 @@
           <w:b/>
           <w:bCs/>
         </w:rPr>
+        <w:t>Régimen de Sanciones:</w:t>
+      </w:r>
+      <w:r>
+        <w:t xml:space="preserve"> Las partes acuerdan que el incumplimiento de las obligaciones contractuales o reglamentarias facultará al Empleador para aplicar medidas disciplinarias, graduadas según la gravedad y reiteración de la falta, de conformidad a lo dispuesto en el Reglamento Interno de Orden, Higiene y Seguridad. Las sanciones aplicables serán:</w:t>
+      </w:r>
+    </w:p>
+    <w:p>
+      <w:r>
+        <w:t>·       </w:t>
+      </w:r>
+      <w:r>
+        <w:rPr>
+          <w:b/>
+          <w:bCs/>
+        </w:rPr>
+        <w:t>a) Amonestación Verbal.</w:t>
+      </w:r>
+    </w:p>
+    <w:p>
+      <w:r>
+        <w:t xml:space="preserve">·       </w:t>
+      </w:r>
+      <w:r>
+        <w:rPr>
+          <w:b/>
+          <w:bCs/>
+        </w:rPr>
+        <w:t>b) Amonestación Escrita:</w:t>
+      </w:r>
+      <w:r>
+        <w:t xml:space="preserve"> Con copia a la Inspección del Trabajo.</w:t>
+      </w:r>
+    </w:p>
+    <w:p>
+      <w:r>
+        <w:t>·       </w:t>
+      </w:r>
+      <w:r>
+        <w:rPr>
+          <w:b/>
+          <w:bCs/>
+        </w:rPr>
+        <w:t>c) Multa:</w:t>
+      </w:r>
+      <w:r>
+        <w:t xml:space="preserve"> De hasta un 25% de la remuneración diaria del trabajador. </w:t>
+      </w:r>
+    </w:p>
+    <w:p>
+      <w:r>
+        <w:t>Todo lo anterior, sin perjuicio de la facultad del Empleador de poner término al contrato si la infracción reviste carácter de grave, según lo dispuesto en el Artículo 160 del Código del Trabajo.</w:t>
+      </w:r>
+    </w:p>
+    <w:p>
+      <w:r>
+        <w:rPr>
+          <w:b/>
+          <w:bCs/>
+        </w:rPr>
+        <w:t>TERCERO: JORNADA DE TRABAJO.</w:t>
+      </w:r>
+      <w:r>
+        <w:t xml:space="preserve"> De conformidad con lo dispuesto en el </w:t>
+      </w:r>
+      <w:r>
+        <w:rPr>
+          <w:b/>
+          <w:bCs/>
+        </w:rPr>
+        <w:t>Artículo 38 del Código del Trabajo</w:t>
+      </w:r>
+      <w:r>
+        <w:t xml:space="preserve"> (faenas de proceso continuo), la jornada ordinaria de trabajo será de </w:t>
+      </w:r>
+      <w:r>
+        <w:rPr>
+          <w:b/>
+          <w:bCs/>
+        </w:rPr>
+        <w:t>21 horas semanales</w:t>
+      </w:r>
+      <w:r>
+        <w:t xml:space="preserve"> (ajustándose automáticamente a los máximos legales vigentes según la gradualidad de la Ley 40 Horas), distribuidas de </w:t>
+      </w:r>
+      <w:proofErr w:type="gramStart"/>
+      <w:r>
+        <w:t>Lunes</w:t>
+      </w:r>
+      <w:proofErr w:type="gramEnd"/>
+      <w:r>
+        <w:t xml:space="preserve"> a Domingo, en un régimen de turnos rotativos.</w:t>
+      </w:r>
+    </w:p>
+    <w:p>
+      <w:r>
+        <w:t>La distribución de los turnos será asignada por la Empresa según las necesidades operativas, siendo los horarios referenciales los siguientes:</w:t>
+      </w:r>
+    </w:p>
+    <w:p>
+      <w:r>
         <w:lastRenderedPageBreak/>
-        <w:t>Régimen de Sanciones:</w:t>
-      </w:r>
-      <w:r>
-        <w:t xml:space="preserve"> Las partes acuerdan que el incumplimiento de las obligaciones contractuales o reglamentarias facultará al Empleador para aplicar medidas disciplinarias, graduadas según la gravedad y reiteración de la falta, de conformidad a lo dispuesto en el Reglamento Interno de Orden, Higiene y Seguridad. Las sanciones aplicables serán:</w:t>
-      </w:r>
-    </w:p>
-    <w:p>
-      <w:r>
-        <w:t>·       </w:t>
-      </w:r>
-      <w:r>
-        <w:rPr>
-          <w:b/>
-          <w:bCs/>
-        </w:rPr>
-        <w:t>a) Amonestación Verbal.</w:t>
-      </w:r>
-    </w:p>
-    <w:p>
-      <w:r>
-        <w:t xml:space="preserve">·       </w:t>
-      </w:r>
-      <w:r>
-        <w:rPr>
-          <w:b/>
-          <w:bCs/>
-        </w:rPr>
-        <w:t>b) Amonestación Escrita:</w:t>
-      </w:r>
-      <w:r>
-        <w:t xml:space="preserve"> Con copia a la Inspección del Trabajo.</w:t>
-      </w:r>
-    </w:p>
-    <w:p>
-      <w:r>
-        <w:t>·       </w:t>
-      </w:r>
-      <w:r>
-        <w:rPr>
-          <w:b/>
-          <w:bCs/>
-        </w:rPr>
-        <w:t>c) Multa:</w:t>
-      </w:r>
-      <w:r>
-        <w:t xml:space="preserve"> De hasta un 25% de la remuneración diaria del trabajador. </w:t>
-      </w:r>
-    </w:p>
-    <w:p>
-      <w:r>
-        <w:t>Todo lo anterior, sin perjuicio de la facultad del Empleador de poner término al contrato si la infracción reviste carácter de grave, según lo dispuesto en el Artículo 160 del Código del Trabajo.</w:t>
-      </w:r>
-    </w:p>
-    <w:p>
-      <w:r>
-        <w:rPr>
-          <w:b/>
-          <w:bCs/>
-        </w:rPr>
-        <w:t>TERCERO: JORNADA DE TRABAJO.</w:t>
-      </w:r>
-      <w:r>
-        <w:t xml:space="preserve"> De conformidad con lo dispuesto en el </w:t>
-      </w:r>
-      <w:r>
-        <w:rPr>
-          <w:b/>
-          <w:bCs/>
-        </w:rPr>
-        <w:t>Artículo 38 del Código del Trabajo</w:t>
-      </w:r>
-      <w:r>
-        <w:t xml:space="preserve"> (faenas de proceso continuo), la jornada ordinaria de trabajo será de </w:t>
-      </w:r>
-      <w:r>
-        <w:rPr>
-          <w:b/>
-          <w:bCs/>
-        </w:rPr>
-        <w:t>21 horas semanales</w:t>
-      </w:r>
-      <w:r>
-        <w:t xml:space="preserve"> (ajustándose automáticamente a los máximos legales vigentes según la gradualidad de la Ley 40 Horas), distribuidas de Lunes a Domingo, en un régimen de turnos rotativos.</w:t>
-      </w:r>
-    </w:p>
-    <w:p>
-      <w:r>
-        <w:t>La distribución de los turnos será asignada por la Empresa según las necesidades operativas, siendo los horarios referenciales los siguientes:</w:t>
-      </w:r>
-    </w:p>
-    <w:p>
-      <w:r>
         <w:t> </w:t>
       </w:r>
     </w:p>
@@ -398,6 +457,9 @@
         <w:t>                                                 </w:t>
       </w:r>
       <w:r>
+        <w:rPr>
+          <w:noProof/>
+        </w:rPr>
         <w:drawing>
           <wp:inline distT="0" distB="0" distL="0" distR="0" wp14:anchorId="5041CC4E" wp14:editId="5232BC4C">
             <wp:extent cx="5612130" cy="1925320"/>
@@ -450,7 +512,9 @@
     </w:p>
     <w:p>
       <w:r>
-        <w:lastRenderedPageBreak/>
+        <w:rPr>
+          <w:noProof/>
+        </w:rPr>
         <w:drawing>
           <wp:inline distT="0" distB="0" distL="0" distR="0" wp14:anchorId="0747B29E" wp14:editId="1BC4BDBA">
             <wp:extent cx="5612130" cy="1941195"/>
@@ -503,6 +567,9 @@
     </w:p>
     <w:p>
       <w:r>
+        <w:rPr>
+          <w:noProof/>
+        </w:rPr>
         <w:drawing>
           <wp:inline distT="0" distB="0" distL="0" distR="0" wp14:anchorId="649C088D" wp14:editId="15F52E4A">
             <wp:extent cx="5612130" cy="1951355"/>
@@ -555,6 +622,10 @@
     </w:p>
     <w:p>
       <w:r>
+        <w:rPr>
+          <w:noProof/>
+        </w:rPr>
+        <w:lastRenderedPageBreak/>
         <w:drawing>
           <wp:inline distT="0" distB="0" distL="0" distR="0" wp14:anchorId="5100E90E" wp14:editId="65576BD1">
             <wp:extent cx="5612130" cy="1955800"/>
@@ -656,11 +727,7 @@
         <w:t>Distribución y Modificaciones:</w:t>
       </w:r>
       <w:r>
-        <w:t xml:space="preserve"> La distribución y asignación de los turnos será informada por el Empleador oportunamente (semanal o mensualmente). Con todo, y dadas las necesidades fluctuantes del servicio, el Empleador tendrá la facultad de </w:t>
-      </w:r>
-      <w:r>
-        <w:lastRenderedPageBreak/>
-        <w:t>modificar este horario y la distribución de los turnos dentro de los límites permitidos por la ley laboral (</w:t>
+        <w:t xml:space="preserve"> La distribución y asignación de los turnos será informada por el Empleador oportunamente (semanal o mensualmente). Con todo, y dadas las necesidades fluctuantes del servicio, el Empleador tendrá la facultad de modificar este horario y la distribución de los turnos dentro de los límites permitidos por la ley laboral (</w:t>
       </w:r>
       <w:r>
         <w:rPr>
@@ -711,6 +778,7 @@
           <w:b/>
           <w:bCs/>
         </w:rPr>
+        <w:lastRenderedPageBreak/>
         <w:t>QUINTO: OBLIGACIONES ADICIONALES, CONFIDENCIALIDAD Y CAPACITACIÓN.</w:t>
       </w:r>
       <w:r>
@@ -721,12 +789,6 @@
       <w:r>
         <w:rPr>
           <w:b/>
-        </w:rPr>
-        <w:t/>
-      </w:r>
-      <w:r>
-        <w:rPr>
-          <w:b/>
           <w:bCs/>
         </w:rPr>
         <w:t>a) Deber de Lealtad y Confidencialidad:</w:t>
@@ -739,12 +801,6 @@
       <w:r>
         <w:rPr>
           <w:b/>
-        </w:rPr>
-        <w:t/>
-      </w:r>
-      <w:r>
-        <w:rPr>
-          <w:b/>
           <w:bCs/>
         </w:rPr>
         <w:t>b) Cuidado y Restitución de Activos:</w:t>
@@ -757,18 +813,20 @@
       <w:r>
         <w:rPr>
           <w:b/>
-        </w:rPr>
-        <w:t/>
-      </w:r>
-      <w:r>
-        <w:rPr>
-          <w:b/>
           <w:bCs/>
         </w:rPr>
         <w:t>c) Uso de Sistemas Informáticos (Sin Expectativa de Privacidad):</w:t>
       </w:r>
       <w:r>
-        <w:t xml:space="preserve"> El Trabajador se obliga a utilizar los sistemas de comunicaciones, correo electrónico corporativo (si se le asignare), tablets de inventario y acceso a Internet, </w:t>
+        <w:t xml:space="preserve"> El Trabajador se obliga a utilizar los sistemas de comunicaciones, correo electrónico corporativo (si se le asignare), </w:t>
+      </w:r>
+      <w:proofErr w:type="spellStart"/>
+      <w:r>
+        <w:t>tablets</w:t>
+      </w:r>
+      <w:proofErr w:type="spellEnd"/>
+      <w:r>
+        <w:t xml:space="preserve"> de inventario y acceso a Internet, </w:t>
       </w:r>
       <w:r>
         <w:rPr>
@@ -778,48 +836,36 @@
         <w:t>exclusivamente para fines laborales</w:t>
       </w:r>
       <w:r>
-        <w:t xml:space="preserve">. El Trabajador declara conocer que estos medios son herramientas de </w:t>
+        <w:t xml:space="preserve">. El Trabajador declara conocer que estos medios son herramientas de trabajo de propiedad de la Empresa, por lo que </w:t>
+      </w:r>
+      <w:r>
+        <w:rPr>
+          <w:b/>
+          <w:bCs/>
+        </w:rPr>
+        <w:t>no existe expectativa de privacidad</w:t>
+      </w:r>
+      <w:r>
+        <w:t xml:space="preserve"> respecto de su uso, facultando al Empleador para realizar revisiones y auditorías de dichos sistemas para verificar el cumplimiento de sus deberes.</w:t>
+      </w:r>
+    </w:p>
+    <w:p>
+      <w:r>
+        <w:rPr>
+          <w:b/>
+          <w:bCs/>
+        </w:rPr>
+        <w:t>d) Autocuidado y Seguridad:</w:t>
+      </w:r>
+      <w:r>
+        <w:t xml:space="preserve"> Desarrollar su trabajo con el máximo cuidado y diligencia, evitando estrictamente cualquier acción u omisión que pueda comprometer la seguridad, salud e </w:t>
       </w:r>
       <w:r>
         <w:lastRenderedPageBreak/>
-        <w:t xml:space="preserve">trabajo de propiedad de la Empresa, por lo que </w:t>
-      </w:r>
-      <w:r>
-        <w:rPr>
-          <w:b/>
-          <w:bCs/>
-        </w:rPr>
-        <w:t>no existe expectativa de privacidad</w:t>
-      </w:r>
-      <w:r>
-        <w:t xml:space="preserve"> respecto de su uso, facultando al Empleador para realizar revisiones y auditorías de dichos sistemas para verificar el cumplimiento de sus deberes.</w:t>
-      </w:r>
-    </w:p>
-    <w:p>
-      <w:r>
-        <w:rPr>
-          <w:b/>
-        </w:rPr>
-        <w:t xml:space="preserve"/>
-      </w:r>
-      <w:r>
-        <w:rPr>
-          <w:b/>
-          <w:bCs/>
-        </w:rPr>
-        <w:t>d) Autocuidado y Seguridad:</w:t>
-      </w:r>
-      <w:r>
-        <w:t xml:space="preserve"> Desarrollar su trabajo con el máximo cuidado y diligencia, evitando estrictamente cualquier acción u omisión que pueda comprometer la seguridad, salud e integridad física propia o del resto de los trabajadores y clientes (Ley 16.744).</w:t>
-      </w:r>
-    </w:p>
-    <w:p>
-      <w:r>
-        <w:rPr>
-          <w:b/>
-        </w:rPr>
-        <w:t/>
-      </w:r>
+        <w:t>integridad física propia o del resto de los trabajadores y clientes (Ley 16.744).</w:t>
+      </w:r>
+    </w:p>
+    <w:p>
       <w:r>
         <w:rPr>
           <w:b/>
@@ -835,12 +881,6 @@
       <w:r>
         <w:rPr>
           <w:b/>
-        </w:rPr>
-        <w:t/>
-      </w:r>
-      <w:r>
-        <w:rPr>
-          <w:b/>
           <w:bCs/>
         </w:rPr>
         <w:t>f) Capacitación Obligatoria:</w:t>
@@ -856,7 +896,15 @@
         <w:t>ARAMCO</w:t>
       </w:r>
       <w:r>
-        <w:t xml:space="preserve"> que le sean asignados (ej: Manipulación de Alimentos, Servicio al Cliente, Seguridad, Protocolos de Venta). Las partes acuerdan que la aprobación de estos cursos constituye una </w:t>
+        <w:t> que le sean asignados (</w:t>
+      </w:r>
+      <w:proofErr w:type="spellStart"/>
+      <w:r>
+        <w:t>ej</w:t>
+      </w:r>
+      <w:proofErr w:type="spellEnd"/>
+      <w:r>
+        <w:t xml:space="preserve">: Manipulación de Alimentos, Servicio al Cliente, Seguridad, Protocolos de Venta). Las partes acuerdan que la aprobación de estos cursos constituye una </w:t>
       </w:r>
       <w:r>
         <w:rPr>
@@ -866,7 +914,15 @@
         <w:t>condición habilitante e indispensable</w:t>
       </w:r>
       <w:r>
-        <w:t xml:space="preserve"> para la idoneidad técnica del cargo. En consecuencia, la negativa injustificada a realizar estos cursos, su reprobación, o la inasistencia a los mismos, será considerada un incumplimiento grave de las obligaciones del contrato (Art. 160 N° 7 del Código del Trabajo), dado que impide garantizar los estándares de servicio y seguridad exigidos por la franquicia.</w:t>
+        <w:t xml:space="preserve"> para la idoneidad técnica del cargo. En consecuencia, la negativa injustificada a realizar estos cursos, su reprobación, o la inasistencia a los mismos, será considerada un incumplimiento grave de las obligaciones del contrato (Art. 160 </w:t>
+      </w:r>
+      <w:proofErr w:type="spellStart"/>
+      <w:r>
+        <w:t>N°</w:t>
+      </w:r>
+      <w:proofErr w:type="spellEnd"/>
+      <w:r>
+        <w:t xml:space="preserve"> 7 del Código del Trabajo), dado que impide garantizar los estándares de servicio y seguridad exigidos por la franquicia.</w:t>
       </w:r>
     </w:p>
     <w:p>
@@ -888,12 +944,21 @@
         </w:rPr>
         <w:t xml:space="preserve">1 </w:t>
       </w:r>
-      <w:r>
-        <w:rPr>
-          <w:b/>
-          <w:bCs/>
-        </w:rPr>
-        <w:t>a)Suplantación en Asistencia:</w:t>
+      <w:proofErr w:type="gramStart"/>
+      <w:r>
+        <w:rPr>
+          <w:b/>
+          <w:bCs/>
+        </w:rPr>
+        <w:t>a)Suplantación</w:t>
+      </w:r>
+      <w:proofErr w:type="gramEnd"/>
+      <w:r>
+        <w:rPr>
+          <w:b/>
+          <w:bCs/>
+        </w:rPr>
+        <w:t xml:space="preserve"> en Asistencia:</w:t>
       </w:r>
       <w:r>
         <w:t xml:space="preserve"> Registrar la asistencia de otro trabajador o permitir que un tercero registre la propia, así como adulterar de cualquier forma el sistema de control horario.</w:t>
@@ -906,12 +971,21 @@
         </w:rPr>
         <w:t xml:space="preserve">2 </w:t>
       </w:r>
-      <w:r>
-        <w:rPr>
-          <w:b/>
-          <w:bCs/>
-        </w:rPr>
-        <w:t>b)Abandono de Trabajo:</w:t>
+      <w:proofErr w:type="gramStart"/>
+      <w:r>
+        <w:rPr>
+          <w:b/>
+          <w:bCs/>
+        </w:rPr>
+        <w:t>b)Abandono</w:t>
+      </w:r>
+      <w:proofErr w:type="gramEnd"/>
+      <w:r>
+        <w:rPr>
+          <w:b/>
+          <w:bCs/>
+        </w:rPr>
+        <w:t xml:space="preserve"> de Trabajo:</w:t>
       </w:r>
       <w:r>
         <w:t xml:space="preserve"> Retirarse del lugar de trabajo o de la zona de ventas asignada antes del término de la jornada pactada sin causa justificada ni autorización expresa de la jefatura.</w:t>
@@ -924,12 +998,21 @@
         </w:rPr>
         <w:t xml:space="preserve">3 </w:t>
       </w:r>
-      <w:r>
-        <w:rPr>
-          <w:b/>
-          <w:bCs/>
-        </w:rPr>
-        <w:t>c)Sustracción de Bienes:</w:t>
+      <w:proofErr w:type="gramStart"/>
+      <w:r>
+        <w:rPr>
+          <w:b/>
+          <w:bCs/>
+        </w:rPr>
+        <w:t>c)Sustracción</w:t>
+      </w:r>
+      <w:proofErr w:type="gramEnd"/>
+      <w:r>
+        <w:rPr>
+          <w:b/>
+          <w:bCs/>
+        </w:rPr>
+        <w:t xml:space="preserve"> de Bienes:</w:t>
       </w:r>
       <w:r>
         <w:t xml:space="preserve"> Sacar fuera de la empresa, ya sea personalmente o por medio de terceros, cualquier tipo de elemento, producto, insumo, herramienta o documento que pertenezca a ella, sin la debida autorización (Guía de Despacho o Boleta de Venta).</w:t>
@@ -943,12 +1026,21 @@
         <w:lastRenderedPageBreak/>
         <w:t xml:space="preserve">4 </w:t>
       </w:r>
-      <w:r>
-        <w:rPr>
-          <w:b/>
-          <w:bCs/>
-        </w:rPr>
-        <w:t>d)Actividades Ajenas:</w:t>
+      <w:proofErr w:type="gramStart"/>
+      <w:r>
+        <w:rPr>
+          <w:b/>
+          <w:bCs/>
+        </w:rPr>
+        <w:t>d)Actividades</w:t>
+      </w:r>
+      <w:proofErr w:type="gramEnd"/>
+      <w:r>
+        <w:rPr>
+          <w:b/>
+          <w:bCs/>
+        </w:rPr>
+        <w:t xml:space="preserve"> Ajenas:</w:t>
       </w:r>
       <w:r>
         <w:t xml:space="preserve"> Ejecutar, durante las horas de trabajo, actividades ajenas a su labor, atender asuntos particulares, o realizar trabajos que no le hayan sido solicitados por el Empleador, distrayéndose de sus funciones contractuales.</w:t>
@@ -961,12 +1053,21 @@
         </w:rPr>
         <w:t xml:space="preserve">5 </w:t>
       </w:r>
-      <w:r>
-        <w:rPr>
-          <w:b/>
-          <w:bCs/>
-        </w:rPr>
-        <w:t>e)Uso de Celular:</w:t>
+      <w:proofErr w:type="gramStart"/>
+      <w:r>
+        <w:rPr>
+          <w:b/>
+          <w:bCs/>
+        </w:rPr>
+        <w:t>e)Uso</w:t>
+      </w:r>
+      <w:proofErr w:type="gramEnd"/>
+      <w:r>
+        <w:rPr>
+          <w:b/>
+          <w:bCs/>
+        </w:rPr>
+        <w:t xml:space="preserve"> de Celular:</w:t>
       </w:r>
       <w:r>
         <w:t xml:space="preserve"> Utilizar el teléfono celular personal, audífonos o dispositivos electrónicos en la zona de desarrollo de sus labores (salón de ventas, caja, cocina), por constituir una falta de respeto al cliente y una distracción riesgosa para la seguridad del recinto.</w:t>
@@ -979,12 +1080,21 @@
         </w:rPr>
         <w:t xml:space="preserve">6 </w:t>
       </w:r>
-      <w:r>
-        <w:rPr>
-          <w:b/>
-          <w:bCs/>
-        </w:rPr>
-        <w:t>f)Uso de Imagen y Redes Sociales (Interno):</w:t>
+      <w:proofErr w:type="gramStart"/>
+      <w:r>
+        <w:rPr>
+          <w:b/>
+          <w:bCs/>
+        </w:rPr>
+        <w:t>f)Uso</w:t>
+      </w:r>
+      <w:proofErr w:type="gramEnd"/>
+      <w:r>
+        <w:rPr>
+          <w:b/>
+          <w:bCs/>
+        </w:rPr>
+        <w:t xml:space="preserve"> de Imagen y Redes Sociales (Interno):</w:t>
       </w:r>
       <w:r>
         <w:t xml:space="preserve"> Grabar videos, tomar fotografías o realizar transmisiones en vivo dentro de la Estación o Tienda (con o sin uniforme) sin autorización de la Empresa, afectando la privacidad de clientes y compañeros o la seguridad de las instalaciones.</w:t>
@@ -997,15 +1107,32 @@
         </w:rPr>
         <w:t xml:space="preserve">7 </w:t>
       </w:r>
-      <w:r>
-        <w:rPr>
-          <w:b/>
-          <w:bCs/>
-        </w:rPr>
-        <w:t>g)Uso de Imagen y Marca (Externo):</w:t>
-      </w:r>
-      <w:r>
-        <w:t xml:space="preserve"> Publicar o difundir en redes sociales o cualquier medio, videos o imágenes donde aparezca con uniforme o haga mención a la marca ARAMCO/ASTOP para fines personales, humorísticos o cualquier propósito que pueda afectar la imagen corporativa o reputación del Empleador.</w:t>
+      <w:proofErr w:type="gramStart"/>
+      <w:r>
+        <w:rPr>
+          <w:b/>
+          <w:bCs/>
+        </w:rPr>
+        <w:t>g)Uso</w:t>
+      </w:r>
+      <w:proofErr w:type="gramEnd"/>
+      <w:r>
+        <w:rPr>
+          <w:b/>
+          <w:bCs/>
+        </w:rPr>
+        <w:t xml:space="preserve"> de Imagen y Marca (Externo):</w:t>
+      </w:r>
+      <w:r>
+        <w:t xml:space="preserve"> Publicar o difundir en redes sociales o cualquier medio, videos o imágenes donde aparezca con uniforme o haga mención </w:t>
+      </w:r>
+      <w:proofErr w:type="gramStart"/>
+      <w:r>
+        <w:t>a</w:t>
+      </w:r>
+      <w:proofErr w:type="gramEnd"/>
+      <w:r>
+        <w:t xml:space="preserve"> la marca ARAMCO/ASTOP para fines personales, humorísticos o cualquier propósito que pueda afectar la imagen corporativa o reputación del Empleador.</w:t>
       </w:r>
     </w:p>
     <w:p>
@@ -1015,12 +1142,21 @@
         </w:rPr>
         <w:t xml:space="preserve">8 </w:t>
       </w:r>
-      <w:r>
-        <w:rPr>
-          <w:b/>
-          <w:bCs/>
-        </w:rPr>
-        <w:t>h)Condiciones del Entorno:</w:t>
+      <w:proofErr w:type="gramStart"/>
+      <w:r>
+        <w:rPr>
+          <w:b/>
+          <w:bCs/>
+        </w:rPr>
+        <w:t>h)Condiciones</w:t>
+      </w:r>
+      <w:proofErr w:type="gramEnd"/>
+      <w:r>
+        <w:rPr>
+          <w:b/>
+          <w:bCs/>
+        </w:rPr>
+        <w:t xml:space="preserve"> del Entorno:</w:t>
       </w:r>
       <w:r>
         <w:t xml:space="preserve"> No mantenerse atento a las condiciones de trabajo, tránsito de clientes y seguridad propias de una tienda de conveniencia (prevención de "robo hormiga").</w:t>
@@ -1033,15 +1169,32 @@
         </w:rPr>
         <w:t xml:space="preserve">9 </w:t>
       </w:r>
-      <w:r>
-        <w:rPr>
-          <w:b/>
-          <w:bCs/>
-        </w:rPr>
-        <w:t>i)Negociaciones Incompatibles:</w:t>
-      </w:r>
-      <w:r>
-        <w:t xml:space="preserve"> Realizar cualquier actividad, remunerada o no, para otras instituciones del mismo giro (competencia) mientras se mantenga vigente la relación laboral. El trabajador se obliga a no ejecutar negociaciones contrarias a los intereses del empleador (Art. 160 N° 2 del Código del Trabajo).</w:t>
+      <w:proofErr w:type="gramStart"/>
+      <w:r>
+        <w:rPr>
+          <w:b/>
+          <w:bCs/>
+        </w:rPr>
+        <w:t>i)Negociaciones</w:t>
+      </w:r>
+      <w:proofErr w:type="gramEnd"/>
+      <w:r>
+        <w:rPr>
+          <w:b/>
+          <w:bCs/>
+        </w:rPr>
+        <w:t xml:space="preserve"> Incompatibles:</w:t>
+      </w:r>
+      <w:r>
+        <w:t xml:space="preserve"> Realizar cualquier actividad, remunerada o no, para otras instituciones del mismo giro (competencia) mientras se mantenga vigente la relación laboral. El trabajador se obliga a no ejecutar negociaciones contrarias a los intereses del empleador (Art. 160 </w:t>
+      </w:r>
+      <w:proofErr w:type="spellStart"/>
+      <w:r>
+        <w:t>N°</w:t>
+      </w:r>
+      <w:proofErr w:type="spellEnd"/>
+      <w:r>
+        <w:t xml:space="preserve"> 2 del Código del Trabajo).</w:t>
       </w:r>
     </w:p>
     <w:p>
@@ -1051,12 +1204,21 @@
         </w:rPr>
         <w:t xml:space="preserve">1 </w:t>
       </w:r>
-      <w:r>
-        <w:rPr>
-          <w:b/>
-          <w:bCs/>
-        </w:rPr>
-        <w:t>j)Reglamento Interno:</w:t>
+      <w:proofErr w:type="gramStart"/>
+      <w:r>
+        <w:rPr>
+          <w:b/>
+          <w:bCs/>
+        </w:rPr>
+        <w:t>j)Reglamento</w:t>
+      </w:r>
+      <w:proofErr w:type="gramEnd"/>
+      <w:r>
+        <w:rPr>
+          <w:b/>
+          <w:bCs/>
+        </w:rPr>
+        <w:t xml:space="preserve"> Interno:</w:t>
       </w:r>
       <w:r>
         <w:t xml:space="preserve"> Infringir cualquier otra prohibición que se encuentre establecida en el Reglamento Interno de Orden, Higiene y Seguridad de la Empresa.</w:t>
@@ -1081,7 +1243,11 @@
         <w:t>esenciales</w:t>
       </w:r>
       <w:r>
-        <w:t xml:space="preserve"> los deberes y prohibiciones indicados en las cláusulas </w:t>
+        <w:t xml:space="preserve"> los </w:t>
+      </w:r>
+      <w:r>
+        <w:lastRenderedPageBreak/>
+        <w:t xml:space="preserve">deberes y prohibiciones indicados en las cláusulas </w:t>
       </w:r>
       <w:r>
         <w:rPr>
@@ -1143,7 +1309,23 @@
           <w:b/>
           <w:bCs/>
         </w:rPr>
-        <w:t>Artículo 160 Nº 7 del Código del Trabajo</w:t>
+        <w:t xml:space="preserve">Artículo 160 </w:t>
+      </w:r>
+      <w:proofErr w:type="spellStart"/>
+      <w:r>
+        <w:rPr>
+          <w:b/>
+          <w:bCs/>
+        </w:rPr>
+        <w:t>Nº</w:t>
+      </w:r>
+      <w:proofErr w:type="spellEnd"/>
+      <w:r>
+        <w:rPr>
+          <w:b/>
+          <w:bCs/>
+        </w:rPr>
+        <w:t xml:space="preserve"> 7 del Código del Trabajo</w:t>
       </w:r>
       <w:r>
         <w:t>.</w:t>
@@ -1151,128 +1333,131 @@
     </w:p>
     <w:p>
       <w:r>
+        <w:t>Lo anterior es sin perjuicio de la reserva de acciones civiles y penales que el Empleador pueda ejercer para perseguir las responsabilidades y la reparación de los perjuicios causados.</w:t>
+      </w:r>
+    </w:p>
+    <w:p>
+      <w:r>
+        <w:rPr>
+          <w:b/>
+          <w:bCs/>
+        </w:rPr>
+        <w:t>OCTAVO: DE LAS REMUNERACIONES.</w:t>
+      </w:r>
+      <w:r>
+        <w:t xml:space="preserve"> En retribución por los servicios prestados, el Empleador pagará al Trabajador una remuneración compuesta por: </w:t>
+      </w:r>
+      <w:r>
+        <w:rPr>
+          <w:b/>
+          <w:bCs/>
+        </w:rPr>
+        <w:t>Sueldo Base:</w:t>
+      </w:r>
+      <w:r>
+        <w:t xml:space="preserve"> La suma mensual de {SUELDO_BASE}</w:t>
+      </w:r>
+      <w:r>
+        <w:rPr>
+          <w:b/>
+          <w:bCs/>
+        </w:rPr>
+        <w:t xml:space="preserve"> ({SUELDO_BASE_PALABRA}).</w:t>
+      </w:r>
+      <w:r>
+        <w:t>, proporcional a los días trabajados.</w:t>
+      </w:r>
+    </w:p>
+    <w:p>
+      <w:r>
+        <w:rPr>
+          <w:b/>
+          <w:bCs/>
+        </w:rPr>
+        <w:t>Gratificación Legal:</w:t>
+      </w:r>
+      <w:r>
+        <w:t xml:space="preserve"> Adicionalmente, el Empleador pagará la gratificación legal mensual conforme al </w:t>
+      </w:r>
+      <w:r>
+        <w:rPr>
+          <w:b/>
+          <w:bCs/>
+        </w:rPr>
+        <w:t>Artículo 50 del Código del Trabajo</w:t>
+      </w:r>
+      <w:r>
+        <w:t xml:space="preserve">, equivalente al 25% de la remuneración mensual con el tope legal de </w:t>
+      </w:r>
+      <w:r>
+        <w:rPr>
+          <w:b/>
+          <w:bCs/>
+        </w:rPr>
+        <w:t>4,75 Ingresos Mínimos Mensuales</w:t>
+      </w:r>
+      <w:r>
+        <w:t xml:space="preserve"> (prorrateados).</w:t>
+      </w:r>
+    </w:p>
+    <w:p>
+      <w:r>
+        <w:rPr>
+          <w:b/>
+          <w:bCs/>
+        </w:rPr>
+        <w:t>Forma y Fecha de Pago:</w:t>
+      </w:r>
+      <w:r>
+        <w:t xml:space="preserve"> Las remuneraciones se pagarán por períodos vencidos, mediante depósito o transferencia bancaria a la cuenta que el Trabajador indique, dentro de los </w:t>
+      </w:r>
+      <w:r>
+        <w:rPr>
+          <w:b/>
+          <w:bCs/>
+        </w:rPr>
+        <w:t>primeros cinco días hábiles</w:t>
+      </w:r>
+      <w:r>
+        <w:t xml:space="preserve"> del mes siguiente a aquel en que se prestaron los servicios.</w:t>
+      </w:r>
+    </w:p>
+    <w:p>
+      <w:r>
+        <w:rPr>
+          <w:b/>
+          <w:bCs/>
+        </w:rPr>
+        <w:t>Liquidación y Reclamos:</w:t>
+      </w:r>
+      <w:r>
+        <w:t xml:space="preserve"> El Empleador entregará el comprobante de remuneraciones (físico o electrónico) dentro del plazo legal. Desde su recepción, el TRABAJADOR dispondrá de un plazo de </w:t>
+      </w:r>
+      <w:r>
+        <w:rPr>
+          <w:b/>
+          <w:bCs/>
+        </w:rPr>
+        <w:t>5 días hábiles</w:t>
+      </w:r>
+      <w:r>
+        <w:t xml:space="preserve"> para efectuar observaciones. Si no ejerciere este derecho en el plazo previsto, se entenderá aceptado el pago a su entera conformidad.</w:t>
+      </w:r>
+    </w:p>
+    <w:p>
+      <w:r>
+        <w:rPr>
+          <w:b/>
+          <w:bCs/>
+        </w:rPr>
+        <w:t>Mera Liberalidad:</w:t>
+      </w:r>
+      <w:r>
+        <w:t xml:space="preserve"> Cualquier otra prestación, bono o aguinaldo ocasional que se conceda al Trabajador, fuera de los estipulados en este contrato, se entenderá otorgado a título </w:t>
+      </w:r>
+      <w:r>
         <w:lastRenderedPageBreak/>
-        <w:t>Lo anterior es sin perjuicio de la reserva de acciones civiles y penales que el Empleador pueda ejercer para perseguir las responsabilidades y la reparación de los perjuicios causados.</w:t>
-      </w:r>
-    </w:p>
-    <w:p>
-      <w:r>
-        <w:rPr>
-          <w:b/>
-          <w:bCs/>
-        </w:rPr>
-        <w:t>OCTAVO: DE LAS REMUNERACIONES.</w:t>
-      </w:r>
-      <w:r>
-        <w:t xml:space="preserve"> En retribución por los servicios prestados, el Empleador pagará al Trabajador una remuneración compuesta por: </w:t>
-      </w:r>
-      <w:r>
-        <w:rPr>
-          <w:b/>
-          <w:bCs/>
-        </w:rPr>
-        <w:t>Sueldo Base:</w:t>
-      </w:r>
-      <w:r>
-        <w:t xml:space="preserve"> La suma mensual de {SUELDO_BASE}</w:t>
-      </w:r>
-      <w:r>
-        <w:rPr>
-          <w:b/>
-          <w:bCs/>
-        </w:rPr>
-        <w:t xml:space="preserve"> ({SUELDO_BASE_PALABRA}).</w:t>
-      </w:r>
-      <w:r>
-        <w:t>, proporcional a los días trabajados.</w:t>
-      </w:r>
-    </w:p>
-    <w:p>
-      <w:r>
-        <w:rPr>
-          <w:b/>
-          <w:bCs/>
-        </w:rPr>
-        <w:t>Gratificación Legal:</w:t>
-      </w:r>
-      <w:r>
-        <w:t xml:space="preserve"> Adicionalmente, el Empleador pagará la gratificación legal mensual conforme al </w:t>
-      </w:r>
-      <w:r>
-        <w:rPr>
-          <w:b/>
-          <w:bCs/>
-        </w:rPr>
-        <w:t>Artículo 50 del Código del Trabajo</w:t>
-      </w:r>
-      <w:r>
-        <w:t xml:space="preserve">, equivalente al 25% de la remuneración mensual con el tope legal de </w:t>
-      </w:r>
-      <w:r>
-        <w:rPr>
-          <w:b/>
-          <w:bCs/>
-        </w:rPr>
-        <w:t>4,75 Ingresos Mínimos Mensuales</w:t>
-      </w:r>
-      <w:r>
-        <w:t xml:space="preserve"> (prorrateados).</w:t>
-      </w:r>
-    </w:p>
-    <w:p>
-      <w:r>
-        <w:rPr>
-          <w:b/>
-          <w:bCs/>
-        </w:rPr>
-        <w:t>Forma y Fecha de Pago:</w:t>
-      </w:r>
-      <w:r>
-        <w:t xml:space="preserve"> Las remuneraciones se pagarán por períodos vencidos, mediante depósito o transferencia bancaria a la cuenta que el Trabajador indique, dentro de los </w:t>
-      </w:r>
-      <w:r>
-        <w:rPr>
-          <w:b/>
-          <w:bCs/>
-        </w:rPr>
-        <w:t>primeros cinco días hábiles</w:t>
-      </w:r>
-      <w:r>
-        <w:t xml:space="preserve"> del mes siguiente a aquel en que se prestaron los servicios.</w:t>
-      </w:r>
-    </w:p>
-    <w:p>
-      <w:r>
-        <w:rPr>
-          <w:b/>
-          <w:bCs/>
-        </w:rPr>
-        <w:t>Liquidación y Reclamos:</w:t>
-      </w:r>
-      <w:r>
-        <w:t xml:space="preserve"> El Empleador entregará el comprobante de remuneraciones (físico o electrónico) dentro del plazo legal. Desde su recepción, el TRABAJADOR dispondrá de un plazo de </w:t>
-      </w:r>
-      <w:r>
-        <w:rPr>
-          <w:b/>
-          <w:bCs/>
-        </w:rPr>
-        <w:t>5 días hábiles</w:t>
-      </w:r>
-      <w:r>
-        <w:t xml:space="preserve"> para efectuar observaciones. Si no ejerciere este derecho en el plazo previsto, se entenderá aceptado el pago a su entera conformidad.</w:t>
-      </w:r>
-    </w:p>
-    <w:p>
-      <w:r>
-        <w:rPr>
-          <w:b/>
-          <w:bCs/>
-        </w:rPr>
-        <w:t>Mera Liberalidad:</w:t>
-      </w:r>
-      <w:r>
-        <w:t xml:space="preserve"> Cualquier otra prestación, bono o aguinaldo ocasional que se conceda al Trabajador, fuera de los estipulados en este contrato, se entenderá otorgado a título de </w:t>
+        <w:t xml:space="preserve">de </w:t>
       </w:r>
       <w:r>
         <w:rPr>
@@ -1341,7 +1526,6 @@
     </w:p>
     <w:p>
       <w:r>
-        <w:lastRenderedPageBreak/>
         <w:t xml:space="preserve">Asimismo, de conformidad con el </w:t>
       </w:r>
       <w:r>
@@ -1371,7 +1555,15 @@
       </w:r>
       <w:r>
         <w:br/>
-        <w:t>b) El monto de las multas que se le impusieren de acuerdo al Reglamento Interno.</w:t>
+        <w:t xml:space="preserve">b) El monto de las multas que se le impusieren </w:t>
+      </w:r>
+      <w:proofErr w:type="gramStart"/>
+      <w:r>
+        <w:t>de acuerdo al</w:t>
+      </w:r>
+      <w:proofErr w:type="gramEnd"/>
+      <w:r>
+        <w:t xml:space="preserve"> Reglamento Interno.</w:t>
       </w:r>
       <w:r>
         <w:br/>
@@ -1433,7 +1625,11 @@
         <w:t>{FECHA_TERMINO_CONTRATO}</w:t>
       </w:r>
       <w:r>
-        <w:t xml:space="preserve">. No obstante, el contrato podrá terminar anticipadamente cuando concurran las causales legales de caducidad o despido establecidas en el Código del Trabajo (Arts. 159, 160 y 161) o las estipuladas en los anexos adjuntos. Se deja constancia, para efectos de antigüedad y feriado legal, que el TRABAJADOR ingresó al servicio el </w:t>
+        <w:t xml:space="preserve">. No obstante, el contrato podrá terminar anticipadamente cuando concurran las causales </w:t>
+      </w:r>
+      <w:r>
+        <w:lastRenderedPageBreak/>
+        <w:t xml:space="preserve">legales de caducidad o despido establecidas en el Código del Trabajo (Arts. 159, 160 y 161) o las estipuladas en los anexos adjuntos. Se deja constancia, para efectos de antigüedad y feriado legal, que el TRABAJADOR ingresó al servicio el </w:t>
       </w:r>
       <w:r>
         <w:rPr>
@@ -1479,55 +1675,55 @@
         <w:t>b) Medios de Pago Irregulares:</w:t>
       </w:r>
       <w:r>
-        <w:t xml:space="preserve"> Si el Trabajador recibe en pago cheques no autorizados, tarjetas de crédito/débito no validadas por la máquina POS o </w:t>
+        <w:t xml:space="preserve"> Si el Trabajador recibe en pago cheques no autorizados, tarjetas de crédito/débito no validadas por la máquina POS o documentos adulterados, será el único responsable pecuniario en caso de no pago por parte del banco. Estos valores serán descontados de sus remuneraciones.</w:t>
+      </w:r>
+    </w:p>
+    <w:p>
+      <w:r>
+        <w:rPr>
+          <w:b/>
+          <w:bCs/>
+        </w:rPr>
+        <w:t>c) Obligación Tributaria (Boletas):</w:t>
+      </w:r>
+      <w:r>
+        <w:t xml:space="preserve"> El Trabajador asume la obligación estricta de emitir la boleta de venta o guía de despacho correspondiente por </w:t>
+      </w:r>
+      <w:r>
+        <w:rPr>
+          <w:b/>
+          <w:bCs/>
+        </w:rPr>
+        <w:t>cada transacción</w:t>
+      </w:r>
+      <w:r>
+        <w:t xml:space="preserve"> realizada, en la oportunidad y forma exigida por el Servicio de Impuestos Internos (SII). El incumplimiento de esta obligación (no entregar boleta) se califica como </w:t>
+      </w:r>
+      <w:r>
+        <w:rPr>
+          <w:b/>
+          <w:bCs/>
+        </w:rPr>
+        <w:t>incumplimiento grave de las obligaciones del contrato</w:t>
+      </w:r>
+      <w:r>
+        <w:t>, facultando a la Empresa para poner término inmediato a la relación laboral, sin perjuicio de repetir contra el trabajador por las multas que la autoridad tributaria imponga.</w:t>
+      </w:r>
+    </w:p>
+    <w:p>
+      <w:r>
+        <w:rPr>
+          <w:b/>
+          <w:bCs/>
+        </w:rPr>
+        <w:t>DÉCIMO TERCERO: OBLIGACIONES COMERCIALES Y DE ATENCIÓN.</w:t>
+      </w:r>
+      <w:r>
+        <w:t xml:space="preserve"> El TRABAJADOR se obliga a respetar las siguientes normas de </w:t>
       </w:r>
       <w:r>
         <w:lastRenderedPageBreak/>
-        <w:t>documentos adulterados, será el único responsable pecuniario en caso de no pago por parte del banco. Estos valores serán descontados de sus remuneraciones.</w:t>
-      </w:r>
-    </w:p>
-    <w:p>
-      <w:r>
-        <w:rPr>
-          <w:b/>
-          <w:bCs/>
-        </w:rPr>
-        <w:t>c) Obligación Tributaria (Boletas):</w:t>
-      </w:r>
-      <w:r>
-        <w:t xml:space="preserve"> El Trabajador asume la obligación estricta de emitir la boleta de venta o guía de despacho correspondiente por </w:t>
-      </w:r>
-      <w:r>
-        <w:rPr>
-          <w:b/>
-          <w:bCs/>
-        </w:rPr>
-        <w:t>cada transacción</w:t>
-      </w:r>
-      <w:r>
-        <w:t xml:space="preserve"> realizada, en la oportunidad y forma exigida por el Servicio de Impuestos Internos (SII). El incumplimiento de esta obligación (no entregar boleta) se califica como </w:t>
-      </w:r>
-      <w:r>
-        <w:rPr>
-          <w:b/>
-          <w:bCs/>
-        </w:rPr>
-        <w:t>incumplimiento grave de las obligaciones del contrato</w:t>
-      </w:r>
-      <w:r>
-        <w:t>, facultando a la Empresa para poner término inmediato a la relación laboral, sin perjuicio de repetir contra el trabajador por las multas que la autoridad tributaria imponga.</w:t>
-      </w:r>
-    </w:p>
-    <w:p>
-      <w:r>
-        <w:rPr>
-          <w:b/>
-          <w:bCs/>
-        </w:rPr>
-        <w:t>DÉCIMO TERCERO: OBLIGACIONES COMERCIALES Y DE ATENCIÓN.</w:t>
-      </w:r>
-      <w:r>
-        <w:t xml:space="preserve"> El TRABAJADOR se obliga a respetar las siguientes normas de desempeño, cuya inobservancia será sancionada conforme al Reglamento Interno:</w:t>
+        <w:t>desempeño, cuya inobservancia será sancionada conforme al Reglamento Interno:</w:t>
       </w:r>
     </w:p>
     <w:p>
@@ -1618,32 +1814,51 @@
           <w:b/>
           <w:bCs/>
         </w:rPr>
-        <w:t>{REGIMEN_PREVISIONAL}{PREVISION}</w:t>
-      </w:r>
-    </w:p>
-    <w:p>
-      <w:r>
-        <w:rPr>
-          <w:b/>
-          <w:bCs/>
-        </w:rPr>
+        <w:t>{REGIMEN_</w:t>
+      </w:r>
+      <w:proofErr w:type="gramStart"/>
+      <w:r>
+        <w:rPr>
+          <w:b/>
+          <w:bCs/>
+        </w:rPr>
+        <w:t>PREVISIONAL}{</w:t>
+      </w:r>
+      <w:proofErr w:type="gramEnd"/>
+      <w:r>
+        <w:rPr>
+          <w:b/>
+          <w:bCs/>
+        </w:rPr>
+        <w:t>PREVISION}</w:t>
+      </w:r>
+    </w:p>
+    <w:p>
+      <w:r>
+        <w:rPr>
+          <w:b/>
+          <w:bCs/>
+        </w:rPr>
+        <w:t>SALUD: {INSTITUCION_SALUD}</w:t>
+      </w:r>
+      <w:r>
+        <w:t xml:space="preserve"> El Empleador se compromete a efectuar las retenciones legales y enterarlas en las instituciones correspondientes.</w:t>
+      </w:r>
+    </w:p>
+    <w:p>
+      <w:r>
+        <w:rPr>
+          <w:b/>
+          <w:bCs/>
+        </w:rPr>
+        <w:t>DÉCIMO SÉPTIMO: CAPACITACIÓN Y SANCIONES (SENCE/ARAMCO).</w:t>
+      </w:r>
+      <w:r>
+        <w:t xml:space="preserve"> La empresa entregará el beneficio de capacitación según el Programa Anual y el D.L. 19.518 (SENCE). El TRABAJADOR asume la obligación de cumplir con los cursos de formación </w:t>
+      </w:r>
+      <w:r>
         <w:lastRenderedPageBreak/>
-        <w:t>SALUD: {INSTITUCION_SALUD}</w:t>
-      </w:r>
-      <w:r>
-        <w:t xml:space="preserve"> El Empleador se compromete a efectuar las retenciones legales y enterarlas en las instituciones correspondientes.</w:t>
-      </w:r>
-    </w:p>
-    <w:p>
-      <w:r>
-        <w:rPr>
-          <w:b/>
-          <w:bCs/>
-        </w:rPr>
-        <w:t>DÉCIMO SÉPTIMO: CAPACITACIÓN Y SANCIONES (SENCE/ARAMCO).</w:t>
-      </w:r>
-      <w:r>
-        <w:t xml:space="preserve"> La empresa entregará el beneficio de capacitación según el Programa Anual y el D.L. 19.518 (SENCE). El TRABAJADOR asume la obligación de cumplir con los cursos de formación asignados (especialmente los de la franquicia Aramco). El incumplimiento injustificado (inasistencia o reprobación) será sancionado según el Capítulo "De las Sanciones" del Reglamento Interno, pudiendo constituir causal de despido si la capacitación es habilitante para el cargo.</w:t>
+        <w:t>asignados (especialmente los de la franquicia Aramco). El incumplimiento injustificado (inasistencia o reprobación) será sancionado según el Capítulo "De las Sanciones" del Reglamento Interno, pudiendo constituir causal de despido si la capacitación es habilitante para el cargo.</w:t>
       </w:r>
     </w:p>
     <w:p>
@@ -1719,7 +1934,15 @@
         <w:t>VIGÉSIMO: AUTORIZACIÓN DE DESCUENTO FINAL.</w:t>
       </w:r>
       <w:r>
-        <w:t xml:space="preserve"> En caso de término del presente contrato, por cualquier causa, el TRABAJADOR autoriza expresamente e irrevocablemente al EMPLEADOR para que deduzca, retenga y compense con cargo a la última liquidación de remuneraciones y/o de su finiquito, todas aquellas sumas que adeudare a la Empresa por concepto de préstamos, anticipos, pérdidas de caja, daños a herramientas o cualquier otro crédito pendiente derivado de la relación laboral.</w:t>
+        <w:t xml:space="preserve"> En caso de término del presente contrato, por cualquier causa, el TRABAJADOR autoriza </w:t>
+      </w:r>
+      <w:proofErr w:type="gramStart"/>
+      <w:r>
+        <w:t>expresamente e irrevocablemente</w:t>
+      </w:r>
+      <w:proofErr w:type="gramEnd"/>
+      <w:r>
+        <w:t xml:space="preserve"> al EMPLEADOR para que deduzca, retenga y compense con cargo a la última liquidación de remuneraciones y/o de su finiquito, todas aquellas sumas que adeudare a la Empresa por concepto de préstamos, anticipos, pérdidas de caja, daños a herramientas o cualquier otro crédito pendiente derivado de la relación laboral.</w:t>
       </w:r>
     </w:p>
     <w:p>
@@ -1768,82 +1991,38 @@
           <w:i/>
           <w:iCs/>
         </w:rPr>
-        <w:t>"Hola, bienvenido a aStop, ¿en qué lo puedo ayudar?"</w:t>
-      </w:r>
-    </w:p>
-    <w:p>
-      <w:r>
-        <w:rPr>
-          <w:b/>
-        </w:rPr>
-        <w:t xml:space="preserve">02. </w:t>
-      </w:r>
-      <w:r>
-        <w:rPr>
-          <w:b/>
-          <w:bCs/>
-        </w:rPr>
-        <w:t>VENTA SUGESTIVA:</w:t>
-      </w:r>
-    </w:p>
-    <w:p>
-      <w:r>
-        <w:t xml:space="preserve">Diga: </w:t>
-      </w:r>
+        <w:t xml:space="preserve">"Hola, bienvenido a </w:t>
+      </w:r>
+      <w:proofErr w:type="spellStart"/>
       <w:r>
         <w:rPr>
           <w:i/>
           <w:iCs/>
         </w:rPr>
-        <w:t>"¿Quiere agregar [Producto XX] o [Promoción] por $[Monto]?"</w:t>
-      </w:r>
-    </w:p>
-    <w:p>
-      <w:r>
-        <w:rPr>
-          <w:b/>
-        </w:rPr>
-        <w:lastRenderedPageBreak/>
-        <w:t xml:space="preserve">03. </w:t>
-      </w:r>
-      <w:r>
-        <w:rPr>
-          <w:b/>
-          <w:bCs/>
-        </w:rPr>
-        <w:t>FIDELIZACIÓN:</w:t>
-      </w:r>
-    </w:p>
-    <w:p>
-      <w:r>
-        <w:t xml:space="preserve">Diga: </w:t>
-      </w:r>
+        <w:t>aStop</w:t>
+      </w:r>
+      <w:proofErr w:type="spellEnd"/>
       <w:r>
         <w:rPr>
           <w:i/>
           <w:iCs/>
         </w:rPr>
-        <w:t>"¿Paga con la Aplicación ARAMCO?"</w:t>
-      </w:r>
-    </w:p>
-    <w:p>
-      <w:r>
-        <w:t>(Si responde SÍ: Indicar dónde escanear).</w:t>
-      </w:r>
-    </w:p>
-    <w:p>
-      <w:r>
-        <w:rPr>
-          <w:b/>
-        </w:rPr>
-        <w:t xml:space="preserve">04. </w:t>
-      </w:r>
-      <w:r>
-        <w:rPr>
-          <w:b/>
-          <w:bCs/>
-        </w:rPr>
-        <w:t>COBRO:</w:t>
+        <w:t>, ¿en qué lo puedo ayudar?"</w:t>
+      </w:r>
+    </w:p>
+    <w:p>
+      <w:r>
+        <w:rPr>
+          <w:b/>
+        </w:rPr>
+        <w:t xml:space="preserve">02. </w:t>
+      </w:r>
+      <w:r>
+        <w:rPr>
+          <w:b/>
+          <w:bCs/>
+        </w:rPr>
+        <w:t>VENTA SUGESTIVA:</w:t>
       </w:r>
     </w:p>
     <w:p>
@@ -1855,46 +2034,27 @@
           <w:i/>
           <w:iCs/>
         </w:rPr>
-        <w:t>"El monto total a pagar es..."</w:t>
-      </w:r>
-    </w:p>
-    <w:p>
-      <w:r>
-        <w:rPr>
-          <w:b/>
-        </w:rPr>
-        <w:t xml:space="preserve">05. </w:t>
-      </w:r>
-      <w:r>
-        <w:rPr>
-          <w:b/>
-          <w:bCs/>
-        </w:rPr>
-        <w:t>HIGIENE DE MANOS:</w:t>
-      </w:r>
-    </w:p>
-    <w:p>
-      <w:r>
-        <w:t>Acción: Lavarse las manos o utilizar alcohol gel visiblemente antes de cada atención que implique manipulación de productos sin envoltorio.</w:t>
-      </w:r>
-    </w:p>
-    <w:p>
-      <w:r>
-        <w:rPr>
-          <w:b/>
-        </w:rPr>
-        <w:t xml:space="preserve">06. </w:t>
-      </w:r>
-      <w:r>
-        <w:rPr>
-          <w:b/>
-          <w:bCs/>
-        </w:rPr>
-        <w:t>DESPEDIDA:</w:t>
-      </w:r>
-    </w:p>
-    <w:p>
-      <w:r>
+        <w:t>"¿Quiere agregar [Producto XX] o [Promoción] por $[Monto]?"</w:t>
+      </w:r>
+    </w:p>
+    <w:p>
+      <w:r>
+        <w:rPr>
+          <w:b/>
+        </w:rPr>
+        <w:t xml:space="preserve">03. </w:t>
+      </w:r>
+      <w:r>
+        <w:rPr>
+          <w:b/>
+          <w:bCs/>
+        </w:rPr>
+        <w:t>FIDELIZACIÓN:</w:t>
+      </w:r>
+    </w:p>
+    <w:p>
+      <w:r>
+        <w:lastRenderedPageBreak/>
         <w:t xml:space="preserve">Diga: </w:t>
       </w:r>
       <w:r>
@@ -1902,15 +2062,110 @@
           <w:i/>
           <w:iCs/>
         </w:rPr>
-        <w:t>"Gracias por venir a aStop"</w:t>
-      </w:r>
-    </w:p>
-    <w:p>
+        <w:t>"¿Paga con la Aplicación ARAMCO?"</w:t>
+      </w:r>
+    </w:p>
+    <w:p>
+      <w:r>
+        <w:t>(Si responde SÍ: Indicar dónde escanear).</w:t>
+      </w:r>
+    </w:p>
+    <w:p>
+      <w:r>
+        <w:rPr>
+          <w:b/>
+        </w:rPr>
+        <w:t xml:space="preserve">04. </w:t>
+      </w:r>
+      <w:r>
+        <w:rPr>
+          <w:b/>
+          <w:bCs/>
+        </w:rPr>
+        <w:t>COBRO:</w:t>
+      </w:r>
+    </w:p>
+    <w:p>
+      <w:r>
+        <w:t xml:space="preserve">Diga: </w:t>
+      </w:r>
       <w:r>
         <w:rPr>
           <w:i/>
           <w:iCs/>
         </w:rPr>
+        <w:t>"El monto total a pagar es..."</w:t>
+      </w:r>
+    </w:p>
+    <w:p>
+      <w:r>
+        <w:rPr>
+          <w:b/>
+        </w:rPr>
+        <w:t xml:space="preserve">05. </w:t>
+      </w:r>
+      <w:r>
+        <w:rPr>
+          <w:b/>
+          <w:bCs/>
+        </w:rPr>
+        <w:t>HIGIENE DE MANOS:</w:t>
+      </w:r>
+    </w:p>
+    <w:p>
+      <w:r>
+        <w:t>Acción: Lavarse las manos o utilizar alcohol gel visiblemente antes de cada atención que implique manipulación de productos sin envoltorio.</w:t>
+      </w:r>
+    </w:p>
+    <w:p>
+      <w:r>
+        <w:rPr>
+          <w:b/>
+        </w:rPr>
+        <w:t xml:space="preserve">06. </w:t>
+      </w:r>
+      <w:r>
+        <w:rPr>
+          <w:b/>
+          <w:bCs/>
+        </w:rPr>
+        <w:t>DESPEDIDA:</w:t>
+      </w:r>
+    </w:p>
+    <w:p>
+      <w:r>
+        <w:t xml:space="preserve">Diga: </w:t>
+      </w:r>
+      <w:r>
+        <w:rPr>
+          <w:i/>
+          <w:iCs/>
+        </w:rPr>
+        <w:t xml:space="preserve">"Gracias por venir a </w:t>
+      </w:r>
+      <w:proofErr w:type="spellStart"/>
+      <w:r>
+        <w:rPr>
+          <w:i/>
+          <w:iCs/>
+        </w:rPr>
+        <w:t>aStop</w:t>
+      </w:r>
+      <w:proofErr w:type="spellEnd"/>
+      <w:r>
+        <w:rPr>
+          <w:i/>
+          <w:iCs/>
+        </w:rPr>
+        <w:t>"</w:t>
+      </w:r>
+    </w:p>
+    <w:p>
+      <w:r>
+        <w:rPr>
+          <w:i/>
+          <w:iCs/>
+        </w:rPr>
         <w:t>El Trabajador acepta que estos pasos pueden ser modificados o actualizados por ARAMCO, obligándose a adoptar los nuevos protocolos que se le comuniquen.</w:t>
       </w:r>
     </w:p>
@@ -1957,12 +2212,28 @@
     </w:p>
     <w:p>
       <w:r>
-        <w:t>·       Rellenar parrillas y coolers de bebidas durante todo el turno.</w:t>
-      </w:r>
-    </w:p>
-    <w:p>
-      <w:r>
-        <w:t xml:space="preserve">·       Mantener el roller con al menos </w:t>
+        <w:t xml:space="preserve">·       Rellenar parrillas y </w:t>
+      </w:r>
+      <w:proofErr w:type="spellStart"/>
+      <w:r>
+        <w:t>coolers</w:t>
+      </w:r>
+      <w:proofErr w:type="spellEnd"/>
+      <w:r>
+        <w:t xml:space="preserve"> de bebidas durante todo el turno.</w:t>
+      </w:r>
+    </w:p>
+    <w:p>
+      <w:r>
+        <w:t xml:space="preserve">·       Mantener el </w:t>
+      </w:r>
+      <w:proofErr w:type="spellStart"/>
+      <w:r>
+        <w:t>roller</w:t>
+      </w:r>
+      <w:proofErr w:type="spellEnd"/>
+      <w:r>
+        <w:t xml:space="preserve"> con al menos </w:t>
       </w:r>
       <w:r>
         <w:rPr>
@@ -2012,6 +2283,7 @@
     </w:p>
     <w:p>
       <w:r>
+        <w:lastRenderedPageBreak/>
         <w:t>·       Mantener vidrios (fachada) y tienda limpia en general.</w:t>
       </w:r>
     </w:p>
@@ -2027,177 +2299,220 @@
         <w:t>Encomiendas:</w:t>
       </w:r>
       <w:r>
-        <w:t xml:space="preserve"> Recibir y entregar encomiendas, sobres y paquetes de los servicios delivery, ingresando correctamente la información en el dispositivo (PDA/Tablet) disponible.</w:t>
-      </w:r>
-    </w:p>
-    <w:p>
+        <w:t xml:space="preserve"> Recibir y entregar encomiendas, sobres y paquetes de los servicios </w:t>
+      </w:r>
+      <w:proofErr w:type="spellStart"/>
+      <w:r>
+        <w:t>delivery</w:t>
+      </w:r>
+      <w:proofErr w:type="spellEnd"/>
+      <w:r>
+        <w:t>, ingresando correctamente la información en el dispositivo (PDA/Tablet) disponible.</w:t>
+      </w:r>
+    </w:p>
+    <w:p>
+      <w:r>
+        <w:t xml:space="preserve">·       </w:t>
+      </w:r>
+      <w:r>
+        <w:rPr>
+          <w:b/>
+          <w:bCs/>
+        </w:rPr>
+        <w:t>Entrega de Turno:</w:t>
+      </w:r>
+      <w:r>
+        <w:t xml:space="preserve"> Entregar el turno con productos ordenados, parrillas repuestas, y pisos y mesones limpios.</w:t>
+      </w:r>
+    </w:p>
+    <w:p>
+      <w:r>
+        <w:rPr>
+          <w:b/>
+          <w:bCs/>
+        </w:rPr>
+        <w:t>B) TURNO NOCHE:</w:t>
+      </w:r>
+    </w:p>
+    <w:p>
+      <w:r>
+        <w:t>·       Revisar el inventario de productos críticos recibido.</w:t>
+      </w:r>
+    </w:p>
+    <w:p>
+      <w:r>
+        <w:t xml:space="preserve">·       Realizar la </w:t>
+      </w:r>
+      <w:r>
+        <w:rPr>
+          <w:b/>
+          <w:bCs/>
+        </w:rPr>
+        <w:t>reposición completa</w:t>
+      </w:r>
+      <w:r>
+        <w:t xml:space="preserve"> para el turno de día siguiente.</w:t>
+      </w:r>
+    </w:p>
+    <w:p>
+      <w:r>
+        <w:t xml:space="preserve">·       </w:t>
+      </w:r>
+      <w:r>
+        <w:rPr>
+          <w:b/>
+          <w:bCs/>
+        </w:rPr>
+        <w:t>Limpieza Profunda:</w:t>
+      </w:r>
+      <w:r>
+        <w:t xml:space="preserve"> Limpiar máquina de café completa, salseras (bombas y contenedores), </w:t>
+      </w:r>
+      <w:proofErr w:type="spellStart"/>
+      <w:r>
+        <w:t>roller</w:t>
+      </w:r>
+      <w:proofErr w:type="spellEnd"/>
+      <w:r>
+        <w:t xml:space="preserve"> y horno.</w:t>
+      </w:r>
+    </w:p>
+    <w:p>
+      <w:r>
+        <w:t>·       Limpiar el vidrio bajo mesón de salsera (por dentro y fuera).</w:t>
+      </w:r>
+    </w:p>
+    <w:p>
+      <w:r>
+        <w:t xml:space="preserve">·       Mantener </w:t>
+      </w:r>
+      <w:proofErr w:type="spellStart"/>
+      <w:r>
+        <w:t>coolers</w:t>
+      </w:r>
+      <w:proofErr w:type="spellEnd"/>
+      <w:r>
+        <w:t xml:space="preserve"> y parrillas repuestas.</w:t>
+      </w:r>
+    </w:p>
+    <w:p>
+      <w:r>
+        <w:t>·       Mantener salsera limpia y con producto suficiente.</w:t>
+      </w:r>
+    </w:p>
+    <w:p>
+      <w:r>
+        <w:t>·       Retirar y botar sus bolsas de basura en los tambores.</w:t>
+      </w:r>
+    </w:p>
+    <w:p>
+      <w:r>
+        <w:t xml:space="preserve">·       Mantener los </w:t>
+      </w:r>
+      <w:r>
+        <w:rPr>
+          <w:b/>
+          <w:bCs/>
+        </w:rPr>
+        <w:t>baños limpios</w:t>
+      </w:r>
+      <w:r>
+        <w:t xml:space="preserve"> y sanitizados.</w:t>
+      </w:r>
+    </w:p>
+    <w:p>
+      <w:r>
+        <w:t xml:space="preserve">·       </w:t>
+      </w:r>
+      <w:r>
+        <w:rPr>
+          <w:b/>
+          <w:bCs/>
+        </w:rPr>
+        <w:t>Servicios de encomienda:</w:t>
+      </w:r>
+      <w:r>
+        <w:t xml:space="preserve"> Gestionar la recepción y entrega de encomiendas en el sistema.</w:t>
+      </w:r>
+    </w:p>
+    <w:p>
+      <w:r>
+        <w:t xml:space="preserve">·       </w:t>
+      </w:r>
+      <w:r>
+        <w:rPr>
+          <w:b/>
+          <w:bCs/>
+        </w:rPr>
+        <w:t>Entrega de Turno:</w:t>
+      </w:r>
+      <w:r>
+        <w:t xml:space="preserve"> Debe entregar el turno con mesones y piso impecables.</w:t>
+      </w:r>
+    </w:p>
+    <w:p>
+      <w:r>
+        <w:rPr>
+          <w:b/>
+          <w:bCs/>
+        </w:rPr>
+        <w:t>Condición de Entrega:</w:t>
+      </w:r>
+      <w:r>
+        <w:t xml:space="preserve"> El turno no se considerará finalizado hasta que el Trabajador saliente haya completado estas tareas y el Trabajador entrante haya verificado su cumplimiento.</w:t>
+      </w:r>
+    </w:p>
+    <w:p>
+      <w:r>
+        <w:rPr>
+          <w:b/>
+          <w:bCs/>
+        </w:rPr>
+        <w:t>VIGÉSIMO TERCERO: DOMICILIO Y JURISDICCIÓN.</w:t>
+      </w:r>
+      <w:r>
+        <w:t xml:space="preserve"> Para todos los efectos legales derivados del presente contrato, las partes fijan su domicilio en {DIRECCION_EMPRESA}.</w:t>
+      </w:r>
+    </w:p>
+    <w:p>
+      <w:r>
+        <w:rPr>
+          <w:b/>
+          <w:bCs/>
+        </w:rPr>
+        <w:t>VIGÉSIMO CUARTO: MODIFICACIONES.</w:t>
+      </w:r>
+      <w:r>
+        <w:t xml:space="preserve"> Toda modificación al presente Contrato de Trabajo deberá extenderse por escrito, sea al reverso de este instrumento o en un documento anexo. </w:t>
+      </w:r>
       <w:r>
         <w:lastRenderedPageBreak/>
-        <w:t xml:space="preserve">·       </w:t>
-      </w:r>
-      <w:r>
-        <w:rPr>
-          <w:b/>
-          <w:bCs/>
-        </w:rPr>
-        <w:t>Entrega de Turno:</w:t>
-      </w:r>
-      <w:r>
-        <w:t xml:space="preserve"> Entregar el turno con productos ordenados, parrillas repuestas, y pisos y mesones limpios.</w:t>
-      </w:r>
-    </w:p>
-    <w:p>
-      <w:r>
-        <w:rPr>
-          <w:b/>
-          <w:bCs/>
-        </w:rPr>
-        <w:t>B) TURNO NOCHE:</w:t>
-      </w:r>
-    </w:p>
-    <w:p>
-      <w:r>
-        <w:t>·       Revisar el inventario de productos críticos recibido.</w:t>
-      </w:r>
-    </w:p>
-    <w:p>
-      <w:r>
-        <w:t xml:space="preserve">·       Realizar la </w:t>
-      </w:r>
-      <w:r>
-        <w:rPr>
-          <w:b/>
-          <w:bCs/>
-        </w:rPr>
-        <w:t>reposición completa</w:t>
-      </w:r>
-      <w:r>
-        <w:t xml:space="preserve"> para el turno de día siguiente.</w:t>
-      </w:r>
-    </w:p>
-    <w:p>
-      <w:r>
-        <w:t xml:space="preserve">·       </w:t>
-      </w:r>
-      <w:r>
-        <w:rPr>
-          <w:b/>
-          <w:bCs/>
-        </w:rPr>
-        <w:t>Limpieza Profunda:</w:t>
-      </w:r>
-      <w:r>
-        <w:t xml:space="preserve"> Limpiar máquina de café completa, salseras (bombas y contenedores), roller y horno.</w:t>
-      </w:r>
-    </w:p>
-    <w:p>
-      <w:r>
-        <w:t>·       Limpiar el vidrio bajo mesón de salsera (por dentro y fuera).</w:t>
-      </w:r>
-    </w:p>
-    <w:p>
-      <w:r>
-        <w:t>·       Mantener coolers y parrillas repuestas.</w:t>
-      </w:r>
-    </w:p>
-    <w:p>
-      <w:r>
-        <w:t>·       Mantener salsera limpia y con producto suficiente.</w:t>
-      </w:r>
-    </w:p>
-    <w:p>
-      <w:r>
-        <w:t>·       Retirar y botar sus bolsas de basura en los tambores.</w:t>
-      </w:r>
-    </w:p>
-    <w:p>
-      <w:r>
-        <w:t xml:space="preserve">·       Mantener los </w:t>
-      </w:r>
-      <w:r>
-        <w:rPr>
-          <w:b/>
-          <w:bCs/>
-        </w:rPr>
-        <w:t>baños limpios</w:t>
-      </w:r>
-      <w:r>
-        <w:t xml:space="preserve"> y sanitizados.</w:t>
-      </w:r>
-    </w:p>
-    <w:p>
-      <w:r>
-        <w:t xml:space="preserve">·       </w:t>
-      </w:r>
-      <w:r>
-        <w:rPr>
-          <w:b/>
-          <w:bCs/>
-        </w:rPr>
-        <w:t>Servicios de encomienda:</w:t>
-      </w:r>
-      <w:r>
-        <w:t xml:space="preserve"> Gestionar la recepción y entrega de encomiendas en el sistema.</w:t>
-      </w:r>
-    </w:p>
-    <w:p>
-      <w:r>
-        <w:t xml:space="preserve">·       </w:t>
-      </w:r>
-      <w:r>
-        <w:rPr>
-          <w:b/>
-          <w:bCs/>
-        </w:rPr>
-        <w:t>Entrega de Turno:</w:t>
-      </w:r>
-      <w:r>
-        <w:t xml:space="preserve"> Debe entregar el turno con mesones y piso impecables.</w:t>
-      </w:r>
-    </w:p>
-    <w:p>
-      <w:r>
-        <w:rPr>
-          <w:b/>
-          <w:bCs/>
-        </w:rPr>
-        <w:t>Condición de Entrega:</w:t>
-      </w:r>
-      <w:r>
-        <w:t xml:space="preserve"> El turno no se considerará finalizado hasta que el Trabajador saliente haya completado estas tareas y el Trabajador entrante haya verificado su cumplimiento.</w:t>
-      </w:r>
-    </w:p>
-    <w:p>
-      <w:r>
-        <w:rPr>
-          <w:b/>
-          <w:bCs/>
-        </w:rPr>
-        <w:t>VIGÉSIMO TERCERO: DOMICILIO Y JURISDICCIÓN.</w:t>
-      </w:r>
-      <w:r>
-        <w:t xml:space="preserve"> Para todos los efectos legales derivados del presente contrato, las partes fijan su domicilio en {DIRECCION_EMPRESA}.</w:t>
-      </w:r>
-    </w:p>
-    <w:p>
-      <w:r>
-        <w:rPr>
-          <w:b/>
-          <w:bCs/>
-        </w:rPr>
-        <w:t>VIGÉSIMO CUARTO: MODIFICACIONES.</w:t>
-      </w:r>
-      <w:r>
-        <w:t xml:space="preserve"> Toda modificación al presente Contrato de Trabajo deberá extenderse por escrito, sea al reverso de este instrumento o en un documento anexo. Dicha modificación, firmada por ambas partes, se tendrá como parte integrante del Contrato de Trabajo.</w:t>
-      </w:r>
-    </w:p>
-    <w:p>
-      <w:r>
-        <w:rPr>
-          <w:b/>
-          <w:bCs/>
-        </w:rPr>
-        <w:t>VIGÉSIMO QUINTO: ESTÁNDARES DE IMAGEN Y OPERACIÓN (aStop).</w:t>
+        <w:t>Dicha modificación, firmada por ambas partes, se tendrá como parte integrante del Contrato de Trabajo.</w:t>
+      </w:r>
+    </w:p>
+    <w:p>
+      <w:r>
+        <w:rPr>
+          <w:b/>
+          <w:bCs/>
+        </w:rPr>
+        <w:t>VIGÉSIMO QUINTO: ESTÁNDARES DE IMAGEN Y OPERACIÓN (</w:t>
+      </w:r>
+      <w:proofErr w:type="spellStart"/>
+      <w:r>
+        <w:rPr>
+          <w:b/>
+          <w:bCs/>
+        </w:rPr>
+        <w:t>aStop</w:t>
+      </w:r>
+      <w:proofErr w:type="spellEnd"/>
+      <w:r>
+        <w:rPr>
+          <w:b/>
+          <w:bCs/>
+        </w:rPr>
+        <w:t>).</w:t>
       </w:r>
       <w:r>
         <w:t xml:space="preserve"> Las partes acuerdan que forman parte integral del presente Contrato las obligaciones y estándares de </w:t>
@@ -2207,7 +2522,23 @@
           <w:b/>
           <w:bCs/>
         </w:rPr>
-        <w:t>"Imagen aStop"</w:t>
+        <w:t xml:space="preserve">"Imagen </w:t>
+      </w:r>
+      <w:proofErr w:type="spellStart"/>
+      <w:r>
+        <w:rPr>
+          <w:b/>
+          <w:bCs/>
+        </w:rPr>
+        <w:t>aStop</w:t>
+      </w:r>
+      <w:proofErr w:type="spellEnd"/>
+      <w:r>
+        <w:rPr>
+          <w:b/>
+          <w:bCs/>
+        </w:rPr>
+        <w:t>"</w:t>
       </w:r>
       <w:r>
         <w:t>. El TRABAJADOR declara conocerlos y se obliga a mantenerlos permanentemente, entendiendo que su incumplimiento afecta la imagen de la franquicia y puede ser sancionado:</w:t>
@@ -2219,37 +2550,271 @@
           <w:b/>
           <w:bCs/>
         </w:rPr>
+        <w:t>I. EXTERIOR DE LA TIENDA:</w:t>
+      </w:r>
+    </w:p>
+    <w:p>
+      <w:r>
+        <w:t>1.  Vidrios limpios, gráfica adherida limpia y en buen estado.</w:t>
+      </w:r>
+    </w:p>
+    <w:p>
+      <w:r>
+        <w:t>2.  Luces funcionando correctamente.</w:t>
+      </w:r>
+    </w:p>
+    <w:p>
+      <w:r>
+        <w:t>3.  Suelo limpio, sin papeles, manchas ni chicles pegados; limpiapiés en buen estado.</w:t>
+      </w:r>
+    </w:p>
+    <w:p>
+      <w:r>
+        <w:t>4.  Mesones de servicio limpios y en buen estado.</w:t>
+      </w:r>
+    </w:p>
+    <w:p>
+      <w:r>
+        <w:rPr>
+          <w:b/>
+          <w:bCs/>
+        </w:rPr>
+        <w:t>II. INTERIOR DE LA TIENDA (Cielo, Suelo, Muros):</w:t>
+      </w:r>
+      <w:r>
+        <w:t xml:space="preserve"> </w:t>
+      </w:r>
+    </w:p>
+    <w:p>
+      <w:r>
+        <w:t xml:space="preserve">1    </w:t>
+      </w:r>
+      <w:proofErr w:type="gramStart"/>
+      <w:r>
+        <w:t>Luces</w:t>
+      </w:r>
+      <w:proofErr w:type="gramEnd"/>
+      <w:r>
+        <w:t xml:space="preserve"> en buen estado y prendidas durante la noche. </w:t>
+      </w:r>
+    </w:p>
+    <w:p>
+      <w:r>
+        <w:t xml:space="preserve">2    </w:t>
+      </w:r>
+      <w:proofErr w:type="gramStart"/>
+      <w:r>
+        <w:t>Pisos</w:t>
+      </w:r>
+      <w:proofErr w:type="gramEnd"/>
+      <w:r>
+        <w:t xml:space="preserve"> limpios, sin papeles, manchas ni chicle pegados.</w:t>
+      </w:r>
+    </w:p>
+    <w:p>
+      <w:r>
+        <w:t xml:space="preserve">3    </w:t>
+      </w:r>
+      <w:proofErr w:type="gramStart"/>
+      <w:r>
+        <w:t>Muros</w:t>
+      </w:r>
+      <w:proofErr w:type="gramEnd"/>
+      <w:r>
+        <w:t xml:space="preserve"> limpios (sin aspecto grasoso).</w:t>
+      </w:r>
+    </w:p>
+    <w:p>
+      <w:r>
+        <w:t xml:space="preserve">4    </w:t>
+      </w:r>
+      <w:proofErr w:type="gramStart"/>
+      <w:r>
+        <w:t>Ambiente</w:t>
+      </w:r>
+      <w:proofErr w:type="gramEnd"/>
+      <w:r>
+        <w:t xml:space="preserve"> con buen olor (a café o a pan).</w:t>
+      </w:r>
+    </w:p>
+    <w:p>
+      <w:r>
+        <w:rPr>
+          <w:b/>
+          <w:bCs/>
+        </w:rPr>
+        <w:t>III. MUEBLES:</w:t>
+      </w:r>
+      <w:r>
+        <w:t xml:space="preserve"> </w:t>
+      </w:r>
+    </w:p>
+    <w:p>
+      <w:r>
+        <w:t xml:space="preserve">1    </w:t>
+      </w:r>
+      <w:proofErr w:type="gramStart"/>
+      <w:r>
+        <w:t>Barras</w:t>
+      </w:r>
+      <w:proofErr w:type="gramEnd"/>
+      <w:r>
+        <w:t xml:space="preserve"> limpias en su superficie y debajo de ellas. </w:t>
+      </w:r>
+    </w:p>
+    <w:p>
+      <w:r>
+        <w:t xml:space="preserve">2    </w:t>
+      </w:r>
+      <w:proofErr w:type="gramStart"/>
+      <w:r>
+        <w:t>Mesón</w:t>
+      </w:r>
+      <w:proofErr w:type="gramEnd"/>
+      <w:r>
+        <w:t xml:space="preserve"> limpio en su superficie y debajo de la cubierta. </w:t>
+      </w:r>
+    </w:p>
+    <w:p>
+      <w:r>
+        <w:t xml:space="preserve">3    </w:t>
+      </w:r>
+      <w:proofErr w:type="gramStart"/>
+      <w:r>
+        <w:t>Basurero</w:t>
+      </w:r>
+      <w:proofErr w:type="gramEnd"/>
+      <w:r>
+        <w:t xml:space="preserve"> limpio y </w:t>
+      </w:r>
+      <w:proofErr w:type="gramStart"/>
+      <w:r>
+        <w:t>de acuerdo a</w:t>
+      </w:r>
+      <w:proofErr w:type="gramEnd"/>
+      <w:r>
+        <w:t xml:space="preserve"> imagen </w:t>
+      </w:r>
+      <w:proofErr w:type="spellStart"/>
+      <w:r>
+        <w:t>aStop</w:t>
+      </w:r>
+      <w:proofErr w:type="spellEnd"/>
+      <w:r>
+        <w:t xml:space="preserve"> (con bolsa en su interior).</w:t>
+      </w:r>
+    </w:p>
+    <w:p>
+      <w:r>
+        <w:rPr>
+          <w:b/>
+          <w:bCs/>
+        </w:rPr>
+        <w:t>IV. MÁQUINAS Y EQUIPOS:</w:t>
+      </w:r>
+      <w:r>
+        <w:t xml:space="preserve"> </w:t>
+      </w:r>
+    </w:p>
+    <w:p>
+      <w:r>
+        <w:t xml:space="preserve">1    </w:t>
+      </w:r>
+      <w:proofErr w:type="spellStart"/>
+      <w:r>
+        <w:t>Coolers</w:t>
+      </w:r>
+      <w:proofErr w:type="spellEnd"/>
+      <w:r>
+        <w:t xml:space="preserve"> de bebidas limpios, bien abastecidos y con productos ordenados. </w:t>
+      </w:r>
+    </w:p>
+    <w:p>
+      <w:r>
+        <w:t xml:space="preserve">2    </w:t>
+      </w:r>
+      <w:proofErr w:type="gramStart"/>
+      <w:r>
+        <w:t>Máquina</w:t>
+      </w:r>
+      <w:proofErr w:type="gramEnd"/>
+      <w:r>
+        <w:t xml:space="preserve"> de salchichas (Roller) limpia, abastecida (50% mínimo) y ordenada. </w:t>
+      </w:r>
+    </w:p>
+    <w:p>
+      <w:r>
+        <w:t xml:space="preserve">3    </w:t>
+      </w:r>
+      <w:proofErr w:type="gramStart"/>
+      <w:r>
+        <w:t>Molinillo</w:t>
+      </w:r>
+      <w:proofErr w:type="gramEnd"/>
+      <w:r>
+        <w:t xml:space="preserve"> de café y máquina de café limpias. </w:t>
+      </w:r>
+    </w:p>
+    <w:p>
+      <w:r>
         <w:lastRenderedPageBreak/>
-        <w:t>I. EXTERIOR DE LA TIENDA:</w:t>
-      </w:r>
-    </w:p>
-    <w:p>
-      <w:r>
-        <w:t>1.  Vidrios limpios, gráfica adherida limpia y en buen estado.</w:t>
-      </w:r>
-    </w:p>
-    <w:p>
-      <w:r>
-        <w:t>2.  Luces funcionando correctamente.</w:t>
-      </w:r>
-    </w:p>
-    <w:p>
-      <w:r>
-        <w:t>3.  Suelo limpio, sin papeles, manchas ni chicles pegados; limpiapiés en buen estado.</w:t>
-      </w:r>
-    </w:p>
-    <w:p>
-      <w:r>
-        <w:t>4.  Mesones de servicio limpios y en buen estado.</w:t>
-      </w:r>
-    </w:p>
-    <w:p>
-      <w:r>
-        <w:rPr>
-          <w:b/>
-          <w:bCs/>
-        </w:rPr>
-        <w:t>II. INTERIOR DE LA TIENDA (Cielo, Suelo, Muros):</w:t>
+        <w:t xml:space="preserve">4    </w:t>
+      </w:r>
+      <w:proofErr w:type="gramStart"/>
+      <w:r>
+        <w:t>Conservadora</w:t>
+      </w:r>
+      <w:proofErr w:type="gramEnd"/>
+      <w:r>
+        <w:t xml:space="preserve"> de sándwich limpia, abastecida (50% mínimo) y ordenada. </w:t>
+      </w:r>
+    </w:p>
+    <w:p>
+      <w:r>
+        <w:t xml:space="preserve">5    </w:t>
+      </w:r>
+      <w:proofErr w:type="gramStart"/>
+      <w:r>
+        <w:t>Salseras</w:t>
+      </w:r>
+      <w:proofErr w:type="gramEnd"/>
+      <w:r>
+        <w:t xml:space="preserve"> limpias (sin manchas, chorreos ni goterones). </w:t>
+      </w:r>
+    </w:p>
+    <w:p>
+      <w:r>
+        <w:t xml:space="preserve">6    </w:t>
+      </w:r>
+      <w:proofErr w:type="gramStart"/>
+      <w:r>
+        <w:t>Salseras</w:t>
+      </w:r>
+      <w:proofErr w:type="gramEnd"/>
+      <w:r>
+        <w:t xml:space="preserve"> con todas sus bombas funcionando y abastecidas. </w:t>
+      </w:r>
+    </w:p>
+    <w:p>
+      <w:r>
+        <w:t xml:space="preserve">7    </w:t>
+      </w:r>
+      <w:proofErr w:type="gramStart"/>
+      <w:r>
+        <w:t>Cajón</w:t>
+      </w:r>
+      <w:proofErr w:type="gramEnd"/>
+      <w:r>
+        <w:t xml:space="preserve"> calentador de pan funcionando y abastecido (50% mínimo). Refrigeradores bajo mesón limpios y ordenados (sin mal olor).</w:t>
+      </w:r>
+    </w:p>
+    <w:p>
+      <w:r>
+        <w:rPr>
+          <w:b/>
+          <w:bCs/>
+        </w:rPr>
+        <w:t>V. PRODUCTOS:</w:t>
       </w:r>
       <w:r>
         <w:t xml:space="preserve"> </w:t>
@@ -2257,124 +2822,65 @@
     </w:p>
     <w:p>
       <w:r>
-        <w:t xml:space="preserve">1    1.  Luces en buen estado y prendidas durante la noche. </w:t>
-      </w:r>
-    </w:p>
-    <w:p>
-      <w:r>
-        <w:t>2    2. Pisos limpios, sin papeles, manchas ni chicle pegados.</w:t>
-      </w:r>
-    </w:p>
-    <w:p>
-      <w:r>
-        <w:t>3    3. Muros limpios (sin aspecto grasoso).</w:t>
-      </w:r>
-    </w:p>
-    <w:p>
-      <w:r>
-        <w:t>4    4. Ambiente con buen olor (a café o a pan).</w:t>
-      </w:r>
-    </w:p>
-    <w:p>
-      <w:r>
-        <w:rPr>
-          <w:b/>
-          <w:bCs/>
-        </w:rPr>
-        <w:t>III. MUEBLES:</w:t>
-      </w:r>
-      <w:r>
-        <w:t xml:space="preserve"> </w:t>
-      </w:r>
-    </w:p>
-    <w:p>
-      <w:r>
-        <w:t xml:space="preserve">1    1. Barras limpias en su superficie y debajo de ellas. </w:t>
-      </w:r>
-    </w:p>
-    <w:p>
-      <w:r>
-        <w:t xml:space="preserve">2    2. Mesón limpio en su superficie y debajo de la cubierta. </w:t>
-      </w:r>
-    </w:p>
-    <w:p>
-      <w:r>
-        <w:t>3    3. Basurero limpio y de acuerdo a imagen aStop (con bolsa en su interior).</w:t>
-      </w:r>
-    </w:p>
-    <w:p>
-      <w:r>
-        <w:rPr>
-          <w:b/>
-          <w:bCs/>
-        </w:rPr>
-        <w:t>IV. MÁQUINAS Y EQUIPOS:</w:t>
-      </w:r>
-      <w:r>
-        <w:t xml:space="preserve"> </w:t>
-      </w:r>
-    </w:p>
-    <w:p>
-      <w:r>
-        <w:t xml:space="preserve">1    1. Coolers de bebidas limpios, bien abastecidos y con productos ordenados. </w:t>
-      </w:r>
-    </w:p>
-    <w:p>
-      <w:r>
-        <w:t xml:space="preserve">2    2.  Máquina de salchichas (Roller) limpia, abastecida (50% mínimo) y ordenada. </w:t>
-      </w:r>
-    </w:p>
-    <w:p>
-      <w:r>
-        <w:t xml:space="preserve">3    3. Molinillo de café y máquina de café limpias. </w:t>
-      </w:r>
-    </w:p>
-    <w:p>
-      <w:r>
-        <w:t xml:space="preserve">4    4. Conservadora de sándwich limpia, abastecida (50% mínimo) y ordenada. </w:t>
-      </w:r>
-    </w:p>
-    <w:p>
-      <w:r>
-        <w:t xml:space="preserve">5    5. Salseras limpias (sin manchas, chorreos ni goterones). </w:t>
-      </w:r>
-    </w:p>
-    <w:p>
-      <w:r>
-        <w:t xml:space="preserve">6    6. Salseras con todas sus bombas funcionando y abastecidas. </w:t>
-      </w:r>
-    </w:p>
-    <w:p>
-      <w:r>
-        <w:t>7    7. Cajón calentador de pan funcionando y abastecido (50% mínimo). Refrigeradores bajo mesón limpios y ordenados (sin mal olor).</w:t>
-      </w:r>
-    </w:p>
-    <w:p>
-      <w:r>
-        <w:rPr>
-          <w:b/>
-          <w:bCs/>
-        </w:rPr>
-        <w:t>V. PRODUCTOS:</w:t>
-      </w:r>
-      <w:r>
-        <w:t xml:space="preserve"> </w:t>
-      </w:r>
-    </w:p>
-    <w:p>
-      <w:r>
-        <w:t xml:space="preserve">1    1. Existencia de todos los productos definidos por aStop en su mix. </w:t>
-      </w:r>
-    </w:p>
-    <w:p>
-      <w:r>
-        <w:t xml:space="preserve">2    2. Ubicación de productos en góndolas según plano de góndolas aStop (Planograma). </w:t>
-      </w:r>
-    </w:p>
-    <w:p>
-      <w:r>
-        <w:lastRenderedPageBreak/>
-        <w:t>3    3. Productos rotulados con precio; si tienen etiqueta, debe estar limpia y legible.</w:t>
+        <w:t xml:space="preserve">1    </w:t>
+      </w:r>
+      <w:proofErr w:type="gramStart"/>
+      <w:r>
+        <w:t>Existencia</w:t>
+      </w:r>
+      <w:proofErr w:type="gramEnd"/>
+      <w:r>
+        <w:t xml:space="preserve"> de todos los productos definidos por </w:t>
+      </w:r>
+      <w:proofErr w:type="spellStart"/>
+      <w:r>
+        <w:t>aStop</w:t>
+      </w:r>
+      <w:proofErr w:type="spellEnd"/>
+      <w:r>
+        <w:t xml:space="preserve"> en su </w:t>
+      </w:r>
+      <w:proofErr w:type="spellStart"/>
+      <w:r>
+        <w:t>mix</w:t>
+      </w:r>
+      <w:proofErr w:type="spellEnd"/>
+      <w:r>
+        <w:t xml:space="preserve">. </w:t>
+      </w:r>
+    </w:p>
+    <w:p>
+      <w:r>
+        <w:t xml:space="preserve">2    </w:t>
+      </w:r>
+      <w:proofErr w:type="gramStart"/>
+      <w:r>
+        <w:t>Ubicación</w:t>
+      </w:r>
+      <w:proofErr w:type="gramEnd"/>
+      <w:r>
+        <w:t xml:space="preserve"> de productos en góndolas según plano de góndolas </w:t>
+      </w:r>
+      <w:proofErr w:type="spellStart"/>
+      <w:r>
+        <w:t>aStop</w:t>
+      </w:r>
+      <w:proofErr w:type="spellEnd"/>
+      <w:r>
+        <w:t xml:space="preserve"> (Planograma). </w:t>
+      </w:r>
+    </w:p>
+    <w:p>
+      <w:r>
+        <w:t xml:space="preserve">3    </w:t>
+      </w:r>
+      <w:proofErr w:type="gramStart"/>
+      <w:r>
+        <w:t>Productos</w:t>
+      </w:r>
+      <w:proofErr w:type="gramEnd"/>
+      <w:r>
+        <w:t xml:space="preserve"> rotulados con precio; si tienen etiqueta, debe estar limpia y legible.</w:t>
       </w:r>
     </w:p>
     <w:p>
@@ -2421,11 +2927,11 @@
         <w:tblLook w:val="04A0" w:firstRow="1" w:lastRow="0" w:firstColumn="1" w:lastColumn="0" w:noHBand="0" w:noVBand="1"/>
       </w:tblPr>
       <w:tblGrid>
-        <w:gridCol w:w="139"/>
-        <w:gridCol w:w="2354"/>
-        <w:gridCol w:w="139"/>
-        <w:gridCol w:w="2528"/>
-        <w:gridCol w:w="139"/>
+        <w:gridCol w:w="235"/>
+        <w:gridCol w:w="3403"/>
+        <w:gridCol w:w="235"/>
+        <w:gridCol w:w="2683"/>
+        <w:gridCol w:w="235"/>
       </w:tblGrid>
       <w:tr>
         <w:trPr>
@@ -2466,7 +2972,7 @@
           </w:tcPr>
           <w:p>
             <w:r>
-              <w:t xml:space="preserve">{CLAUSULAS_ADICIONALES}</w:t>
+              <w:t>{CLAUSULAS_ADICIONALES}</w:t>
             </w:r>
           </w:p>
           <w:p>
@@ -2784,11 +3290,11 @@
         <w:tblLook w:val="04A0" w:firstRow="1" w:lastRow="0" w:firstColumn="1" w:lastColumn="0" w:noHBand="0" w:noVBand="1"/>
       </w:tblPr>
       <w:tblGrid>
-        <w:gridCol w:w="139"/>
-        <w:gridCol w:w="139"/>
-        <w:gridCol w:w="139"/>
-        <w:gridCol w:w="139"/>
-        <w:gridCol w:w="139"/>
+        <w:gridCol w:w="235"/>
+        <w:gridCol w:w="235"/>
+        <w:gridCol w:w="235"/>
+        <w:gridCol w:w="235"/>
+        <w:gridCol w:w="235"/>
       </w:tblGrid>
       <w:tr>
         <w:trPr>
@@ -3705,6 +4211,7 @@
   <w:style w:type="character" w:default="1" w:styleId="Fuentedeprrafopredeter">
     <w:name w:val="Default Paragraph Font"/>
     <w:uiPriority w:val="1"/>
+    <w:semiHidden/>
     <w:unhideWhenUsed/>
   </w:style>
   <w:style w:type="table" w:default="1" w:styleId="Tablanormal">

</xml_diff>